<commit_message>
Refresh CS4023 public resources (2026-09-30 15:34)
</commit_message>
<xml_diff>
--- a/tutorials/Week_07_Midterm_and_Synchronisation/Midterm_Sample_Questions.docx
+++ b/tutorials/Week_07_Midterm_and_Synchronisation/Midterm_Sample_Questions.docx
@@ -11,13 +11,13 @@
         <w:t xml:space="preserve">CS4023 Operating Systems — Midterm Exam: Sample Questions</w:t>
       </w:r>
     </w:p>
-    <w:bookmarkStart w:id="10" w:name="Xa1952e404139809d90b8c3e0adcafa705c227dc"/>
+    <w:bookmarkStart w:id="10" w:name="minutes-30-questions"/>
     <w:p>
       <w:pPr>
         <w:pStyle w:val="Heading2"/>
       </w:pPr>
       <w:r>
-        <w:t xml:space="preserve">Exam Date: 23 October 2026 | 45 minutes | 30 questions</w:t>
+        <w:t xml:space="preserve">45 minutes | 30 questions</w:t>
       </w:r>
     </w:p>
     <w:p>
@@ -3830,7 +3830,7 @@
               <w:pStyle w:val="Compact"/>
             </w:pPr>
             <w:r>
-              <w:t xml:space="preserve">OS overview, dual-mode, system call categories</w:t>
+              <w:t xml:space="preserve">OS overview, OS types, kernel architectures (monolithic, microkernel, hybrid)</w:t>
             </w:r>
           </w:p>
         </w:tc>
@@ -3865,7 +3865,7 @@
               <w:pStyle w:val="Compact"/>
             </w:pPr>
             <w:r>
-              <w:t xml:space="preserve">Interrupts, DMA, OS architecture, system calls</w:t>
+              <w:t xml:space="preserve">Interrupts, DMA, OS architecture, system calls and their categories</w:t>
             </w:r>
           </w:p>
         </w:tc>

</xml_diff>

<commit_message>
Refresh CS4023 public resources (2026-09-30 16:32)
</commit_message>
<xml_diff>
--- a/tutorials/Week_07_Midterm_and_Synchronisation/Midterm_Sample_Questions.docx
+++ b/tutorials/Week_07_Midterm_and_Synchronisation/Midterm_Sample_Questions.docx
@@ -232,91 +232,33 @@
     </w:p>
     <w:p>
       <w:pPr>
-        <w:pStyle w:val="Compact"/>
-        <w:numPr>
-          <w:ilvl w:val="0"/>
-          <w:numId w:val="1002"/>
-        </w:numPr>
-      </w:pPr>
-    </w:p>
-    <w:p>
-      <w:pPr>
-        <w:pStyle w:val="Compact"/>
-        <w:numPr>
-          <w:ilvl w:val="1"/>
-          <w:numId w:val="1003"/>
-        </w:numPr>
-      </w:pPr>
-      <w:r>
-        <w:t xml:space="preserve">All OS services running as separate user-space servers that communicate via IPC</w:t>
-      </w:r>
-    </w:p>
-    <w:p>
-      <w:pPr>
-        <w:pStyle w:val="Compact"/>
-        <w:numPr>
-          <w:ilvl w:val="0"/>
-          <w:numId w:val="1002"/>
-        </w:numPr>
-      </w:pPr>
-    </w:p>
-    <w:p>
-      <w:pPr>
-        <w:pStyle w:val="Compact"/>
-        <w:numPr>
-          <w:ilvl w:val="1"/>
-          <w:numId w:val="1004"/>
-        </w:numPr>
-      </w:pPr>
-      <w:r>
-        <w:t xml:space="preserve">A small kernel providing only essential services such as IPC and basic scheduling</w:t>
-      </w:r>
-    </w:p>
-    <w:p>
-      <w:pPr>
-        <w:pStyle w:val="Compact"/>
-        <w:numPr>
-          <w:ilvl w:val="0"/>
-          <w:numId w:val="1002"/>
-        </w:numPr>
-      </w:pPr>
-    </w:p>
-    <w:p>
-      <w:pPr>
-        <w:pStyle w:val="Compact"/>
-        <w:numPr>
-          <w:ilvl w:val="1"/>
-          <w:numId w:val="1005"/>
-        </w:numPr>
-      </w:pPr>
-      <w:r>
-        <w:t xml:space="preserve">All OS services (scheduling, file systems, drivers, memory management) running together in kernel space</w:t>
-      </w:r>
-    </w:p>
-    <w:p>
-      <w:pPr>
-        <w:pStyle w:val="Compact"/>
-        <w:numPr>
-          <w:ilvl w:val="0"/>
-          <w:numId w:val="1002"/>
-        </w:numPr>
-      </w:pPr>
-    </w:p>
-    <w:p>
-      <w:pPr>
-        <w:pStyle w:val="Compact"/>
-        <w:numPr>
-          <w:ilvl w:val="1"/>
-          <w:numId w:val="1006"/>
-        </w:numPr>
-      </w:pPr>
-      <w:r>
-        <w:t xml:space="preserve">The OS kernel being split into hardware-specific and hardware-independent layers</w:t>
-      </w:r>
-    </w:p>
-    <w:p>
-      <w:pPr>
-        <w:pStyle w:val="FirstParagraph"/>
+        <w:pStyle w:val="BodyText"/>
+      </w:pPr>
+      <w:r>
+        <w:t xml:space="preserve">a) All OS services running as separate user-space servers that communicate via IPC</w:t>
+      </w:r>
+      <w:r>
+        <w:br/>
+      </w:r>
+      <w:r>
+        <w:t xml:space="preserve">b) A small kernel providing only essential services such as IPC and basic scheduling</w:t>
+      </w:r>
+      <w:r>
+        <w:br/>
+      </w:r>
+      <w:r>
+        <w:t xml:space="preserve">c) All OS services (scheduling, file systems, drivers, memory management) running together in kernel space</w:t>
+      </w:r>
+      <w:r>
+        <w:br/>
+      </w:r>
+      <w:r>
+        <w:t xml:space="preserve">d) The OS kernel being split into hardware-specific and hardware-independent layers</w:t>
+      </w:r>
+    </w:p>
+    <w:p>
+      <w:pPr>
+        <w:pStyle w:val="BodyText"/>
       </w:pPr>
       <w:r>
         <w:rPr>
@@ -379,91 +321,33 @@
     </w:p>
     <w:p>
       <w:pPr>
-        <w:pStyle w:val="Compact"/>
-        <w:numPr>
-          <w:ilvl w:val="0"/>
-          <w:numId w:val="1007"/>
-        </w:numPr>
-      </w:pPr>
-    </w:p>
-    <w:p>
-      <w:pPr>
-        <w:pStyle w:val="Compact"/>
-        <w:numPr>
-          <w:ilvl w:val="1"/>
-          <w:numId w:val="1008"/>
-        </w:numPr>
-      </w:pPr>
-      <w:r>
-        <w:t xml:space="preserve">Running → Ready</w:t>
-      </w:r>
-    </w:p>
-    <w:p>
-      <w:pPr>
-        <w:pStyle w:val="Compact"/>
-        <w:numPr>
-          <w:ilvl w:val="0"/>
-          <w:numId w:val="1007"/>
-        </w:numPr>
-      </w:pPr>
-    </w:p>
-    <w:p>
-      <w:pPr>
-        <w:pStyle w:val="Compact"/>
-        <w:numPr>
-          <w:ilvl w:val="1"/>
-          <w:numId w:val="1009"/>
-        </w:numPr>
-      </w:pPr>
-      <w:r>
-        <w:t xml:space="preserve">Ready → Running</w:t>
-      </w:r>
-    </w:p>
-    <w:p>
-      <w:pPr>
-        <w:pStyle w:val="Compact"/>
-        <w:numPr>
-          <w:ilvl w:val="0"/>
-          <w:numId w:val="1007"/>
-        </w:numPr>
-      </w:pPr>
-    </w:p>
-    <w:p>
-      <w:pPr>
-        <w:pStyle w:val="Compact"/>
-        <w:numPr>
-          <w:ilvl w:val="1"/>
-          <w:numId w:val="1010"/>
-        </w:numPr>
-      </w:pPr>
-      <w:r>
-        <w:t xml:space="preserve">Running → Waiting</w:t>
-      </w:r>
-    </w:p>
-    <w:p>
-      <w:pPr>
-        <w:pStyle w:val="Compact"/>
-        <w:numPr>
-          <w:ilvl w:val="0"/>
-          <w:numId w:val="1007"/>
-        </w:numPr>
-      </w:pPr>
-    </w:p>
-    <w:p>
-      <w:pPr>
-        <w:pStyle w:val="Compact"/>
-        <w:numPr>
-          <w:ilvl w:val="1"/>
-          <w:numId w:val="1011"/>
-        </w:numPr>
-      </w:pPr>
-      <w:r>
-        <w:t xml:space="preserve">Waiting → Ready</w:t>
-      </w:r>
-    </w:p>
-    <w:p>
-      <w:pPr>
-        <w:pStyle w:val="FirstParagraph"/>
+        <w:pStyle w:val="BodyText"/>
+      </w:pPr>
+      <w:r>
+        <w:t xml:space="preserve">a) Running → Ready</w:t>
+      </w:r>
+      <w:r>
+        <w:br/>
+      </w:r>
+      <w:r>
+        <w:t xml:space="preserve">b) Ready → Running</w:t>
+      </w:r>
+      <w:r>
+        <w:br/>
+      </w:r>
+      <w:r>
+        <w:t xml:space="preserve">c) Running → Waiting</w:t>
+      </w:r>
+      <w:r>
+        <w:br/>
+      </w:r>
+      <w:r>
+        <w:t xml:space="preserve">d) Waiting → Ready</w:t>
+      </w:r>
+    </w:p>
+    <w:p>
+      <w:pPr>
+        <w:pStyle w:val="BodyText"/>
       </w:pPr>
       <w:r>
         <w:rPr>
@@ -583,91 +467,33 @@
     </w:p>
     <w:p>
       <w:pPr>
-        <w:pStyle w:val="Compact"/>
-        <w:numPr>
-          <w:ilvl w:val="0"/>
-          <w:numId w:val="1012"/>
-        </w:numPr>
-      </w:pPr>
-    </w:p>
-    <w:p>
-      <w:pPr>
-        <w:pStyle w:val="Compact"/>
-        <w:numPr>
-          <w:ilvl w:val="1"/>
-          <w:numId w:val="1013"/>
-        </w:numPr>
-      </w:pPr>
-      <w:r>
-        <w:t xml:space="preserve">A process’s pages are encrypted before being swapped to disk</w:t>
-      </w:r>
-    </w:p>
-    <w:p>
-      <w:pPr>
-        <w:pStyle w:val="Compact"/>
-        <w:numPr>
-          <w:ilvl w:val="0"/>
-          <w:numId w:val="1012"/>
-        </w:numPr>
-      </w:pPr>
-    </w:p>
-    <w:p>
-      <w:pPr>
-        <w:pStyle w:val="Compact"/>
-        <w:numPr>
-          <w:ilvl w:val="1"/>
-          <w:numId w:val="1014"/>
-        </w:numPr>
-      </w:pPr>
-      <w:r>
-        <w:t xml:space="preserve">The OS spends more time swapping pages in and out than executing useful process instructions</w:t>
-      </w:r>
-    </w:p>
-    <w:p>
-      <w:pPr>
-        <w:pStyle w:val="Compact"/>
-        <w:numPr>
-          <w:ilvl w:val="0"/>
-          <w:numId w:val="1012"/>
-        </w:numPr>
-      </w:pPr>
-    </w:p>
-    <w:p>
-      <w:pPr>
-        <w:pStyle w:val="Compact"/>
-        <w:numPr>
-          <w:ilvl w:val="1"/>
-          <w:numId w:val="1015"/>
-        </w:numPr>
-      </w:pPr>
-      <w:r>
-        <w:t xml:space="preserve">The CPU repeatedly processes the same instruction due to a pipeline stall</w:t>
-      </w:r>
-    </w:p>
-    <w:p>
-      <w:pPr>
-        <w:pStyle w:val="Compact"/>
-        <w:numPr>
-          <w:ilvl w:val="0"/>
-          <w:numId w:val="1012"/>
-        </w:numPr>
-      </w:pPr>
-    </w:p>
-    <w:p>
-      <w:pPr>
-        <w:pStyle w:val="Compact"/>
-        <w:numPr>
-          <w:ilvl w:val="1"/>
-          <w:numId w:val="1016"/>
-        </w:numPr>
-      </w:pPr>
-      <w:r>
-        <w:t xml:space="preserve">A process’s working set exceeds the kernel’s maximum page table size</w:t>
-      </w:r>
-    </w:p>
-    <w:p>
-      <w:pPr>
-        <w:pStyle w:val="FirstParagraph"/>
+        <w:pStyle w:val="BodyText"/>
+      </w:pPr>
+      <w:r>
+        <w:t xml:space="preserve">a) A process’s pages are encrypted before being swapped to disk</w:t>
+      </w:r>
+      <w:r>
+        <w:br/>
+      </w:r>
+      <w:r>
+        <w:t xml:space="preserve">b) The OS spends more time swapping pages in and out than executing useful process instructions</w:t>
+      </w:r>
+      <w:r>
+        <w:br/>
+      </w:r>
+      <w:r>
+        <w:t xml:space="preserve">c) The CPU repeatedly processes the same instruction due to a pipeline stall</w:t>
+      </w:r>
+      <w:r>
+        <w:br/>
+      </w:r>
+      <w:r>
+        <w:t xml:space="preserve">d) A process’s working set exceeds the kernel’s maximum page table size</w:t>
+      </w:r>
+    </w:p>
+    <w:p>
+      <w:pPr>
+        <w:pStyle w:val="BodyText"/>
       </w:pPr>
       <w:r>
         <w:rPr>
@@ -783,91 +609,33 @@
     </w:p>
     <w:p>
       <w:pPr>
-        <w:pStyle w:val="Compact"/>
-        <w:numPr>
-          <w:ilvl w:val="0"/>
-          <w:numId w:val="1017"/>
-        </w:numPr>
-      </w:pPr>
-    </w:p>
-    <w:p>
-      <w:pPr>
-        <w:pStyle w:val="Compact"/>
-        <w:numPr>
-          <w:ilvl w:val="1"/>
-          <w:numId w:val="1018"/>
-        </w:numPr>
-      </w:pPr>
-      <w:r>
-        <w:t xml:space="preserve">Threads share heap memory, making data sharing between units of work cheaper</w:t>
-      </w:r>
-    </w:p>
-    <w:p>
-      <w:pPr>
-        <w:pStyle w:val="Compact"/>
-        <w:numPr>
-          <w:ilvl w:val="0"/>
-          <w:numId w:val="1017"/>
-        </w:numPr>
-      </w:pPr>
-    </w:p>
-    <w:p>
-      <w:pPr>
-        <w:pStyle w:val="Compact"/>
-        <w:numPr>
-          <w:ilvl w:val="1"/>
-          <w:numId w:val="1019"/>
-        </w:numPr>
-      </w:pPr>
-      <w:r>
-        <w:t xml:space="preserve">Thread creation is faster than process creation because no address space is duplicated</w:t>
-      </w:r>
-    </w:p>
-    <w:p>
-      <w:pPr>
-        <w:pStyle w:val="Compact"/>
-        <w:numPr>
-          <w:ilvl w:val="0"/>
-          <w:numId w:val="1017"/>
-        </w:numPr>
-      </w:pPr>
-    </w:p>
-    <w:p>
-      <w:pPr>
-        <w:pStyle w:val="Compact"/>
-        <w:numPr>
-          <w:ilvl w:val="1"/>
-          <w:numId w:val="1020"/>
-        </w:numPr>
-      </w:pPr>
-      <w:r>
-        <w:t xml:space="preserve">Using threads guarantees that a bug in one connection handler cannot crash the server</w:t>
-      </w:r>
-    </w:p>
-    <w:p>
-      <w:pPr>
-        <w:pStyle w:val="Compact"/>
-        <w:numPr>
-          <w:ilvl w:val="0"/>
-          <w:numId w:val="1017"/>
-        </w:numPr>
-      </w:pPr>
-    </w:p>
-    <w:p>
-      <w:pPr>
-        <w:pStyle w:val="Compact"/>
-        <w:numPr>
-          <w:ilvl w:val="1"/>
-          <w:numId w:val="1021"/>
-        </w:numPr>
-      </w:pPr>
-      <w:r>
-        <w:t xml:space="preserve">Context-switching between threads of the same process is less expensive than between separate processes</w:t>
-      </w:r>
-    </w:p>
-    <w:p>
-      <w:pPr>
-        <w:pStyle w:val="FirstParagraph"/>
+        <w:pStyle w:val="BodyText"/>
+      </w:pPr>
+      <w:r>
+        <w:t xml:space="preserve">a) Threads share heap memory, making data sharing between units of work cheaper</w:t>
+      </w:r>
+      <w:r>
+        <w:br/>
+      </w:r>
+      <w:r>
+        <w:t xml:space="preserve">b) Thread creation is faster than process creation because no address space is duplicated</w:t>
+      </w:r>
+      <w:r>
+        <w:br/>
+      </w:r>
+      <w:r>
+        <w:t xml:space="preserve">c) Using threads guarantees that a bug in one connection handler cannot crash the server</w:t>
+      </w:r>
+      <w:r>
+        <w:br/>
+      </w:r>
+      <w:r>
+        <w:t xml:space="preserve">d) Context-switching between threads of the same process is less expensive than between separate processes</w:t>
+      </w:r>
+    </w:p>
+    <w:p>
+      <w:pPr>
+        <w:pStyle w:val="BodyText"/>
       </w:pPr>
       <w:r>
         <w:rPr>
@@ -962,91 +730,33 @@
     </w:p>
     <w:p>
       <w:pPr>
-        <w:pStyle w:val="Compact"/>
-        <w:numPr>
-          <w:ilvl w:val="0"/>
-          <w:numId w:val="1022"/>
-        </w:numPr>
-      </w:pPr>
-    </w:p>
-    <w:p>
-      <w:pPr>
-        <w:pStyle w:val="Compact"/>
-        <w:numPr>
-          <w:ilvl w:val="1"/>
-          <w:numId w:val="1023"/>
-        </w:numPr>
-      </w:pPr>
-      <w:r>
-        <w:t xml:space="preserve">Mutual exclusion — at most one process may be in the critical section at any time</w:t>
-      </w:r>
-    </w:p>
-    <w:p>
-      <w:pPr>
-        <w:pStyle w:val="Compact"/>
-        <w:numPr>
-          <w:ilvl w:val="0"/>
-          <w:numId w:val="1022"/>
-        </w:numPr>
-      </w:pPr>
-    </w:p>
-    <w:p>
-      <w:pPr>
-        <w:pStyle w:val="Compact"/>
-        <w:numPr>
-          <w:ilvl w:val="1"/>
-          <w:numId w:val="1024"/>
-        </w:numPr>
-      </w:pPr>
-      <w:r>
-        <w:t xml:space="preserve">Progress — if no process is in the critical section, one of the waiting processes must eventually enter</w:t>
-      </w:r>
-    </w:p>
-    <w:p>
-      <w:pPr>
-        <w:pStyle w:val="Compact"/>
-        <w:numPr>
-          <w:ilvl w:val="0"/>
-          <w:numId w:val="1022"/>
-        </w:numPr>
-      </w:pPr>
-    </w:p>
-    <w:p>
-      <w:pPr>
-        <w:pStyle w:val="Compact"/>
-        <w:numPr>
-          <w:ilvl w:val="1"/>
-          <w:numId w:val="1025"/>
-        </w:numPr>
-      </w:pPr>
-      <w:r>
-        <w:t xml:space="preserve">Bounded waiting — there is a limit on how many times other processes can enter before a waiting process is admitted</w:t>
-      </w:r>
-    </w:p>
-    <w:p>
-      <w:pPr>
-        <w:pStyle w:val="Compact"/>
-        <w:numPr>
-          <w:ilvl w:val="0"/>
-          <w:numId w:val="1022"/>
-        </w:numPr>
-      </w:pPr>
-    </w:p>
-    <w:p>
-      <w:pPr>
-        <w:pStyle w:val="Compact"/>
-        <w:numPr>
-          <w:ilvl w:val="1"/>
-          <w:numId w:val="1026"/>
-        </w:numPr>
-      </w:pPr>
-      <w:r>
-        <w:t xml:space="preserve">Preemptability — a process inside the critical section may be forcibly removed by the OS if a higher-priority process arrives</w:t>
-      </w:r>
-    </w:p>
-    <w:p>
-      <w:pPr>
-        <w:pStyle w:val="FirstParagraph"/>
+        <w:pStyle w:val="BodyText"/>
+      </w:pPr>
+      <w:r>
+        <w:t xml:space="preserve">a) Mutual exclusion — at most one process may be in the critical section at any time</w:t>
+      </w:r>
+      <w:r>
+        <w:br/>
+      </w:r>
+      <w:r>
+        <w:t xml:space="preserve">b) Progress — if no process is in the critical section, one of the waiting processes must eventually enter</w:t>
+      </w:r>
+      <w:r>
+        <w:br/>
+      </w:r>
+      <w:r>
+        <w:t xml:space="preserve">c) Bounded waiting — there is a limit on how many times other processes can enter before a waiting process is admitted</w:t>
+      </w:r>
+      <w:r>
+        <w:br/>
+      </w:r>
+      <w:r>
+        <w:t xml:space="preserve">d) Preemptability — a process inside the critical section may be forcibly removed by the OS if a higher-priority process arrives</w:t>
+      </w:r>
+    </w:p>
+    <w:p>
+      <w:pPr>
+        <w:pStyle w:val="BodyText"/>
       </w:pPr>
       <w:r>
         <w:rPr>
@@ -1345,91 +1055,33 @@
     </w:p>
     <w:p>
       <w:pPr>
-        <w:pStyle w:val="Compact"/>
-        <w:numPr>
-          <w:ilvl w:val="0"/>
-          <w:numId w:val="1027"/>
-        </w:numPr>
-      </w:pPr>
-    </w:p>
-    <w:p>
-      <w:pPr>
-        <w:pStyle w:val="Compact"/>
-        <w:numPr>
-          <w:ilvl w:val="1"/>
-          <w:numId w:val="1028"/>
-        </w:numPr>
-      </w:pPr>
-      <w:r>
-        <w:t xml:space="preserve">1</w:t>
-      </w:r>
-    </w:p>
-    <w:p>
-      <w:pPr>
-        <w:pStyle w:val="Compact"/>
-        <w:numPr>
-          <w:ilvl w:val="0"/>
-          <w:numId w:val="1027"/>
-        </w:numPr>
-      </w:pPr>
-    </w:p>
-    <w:p>
-      <w:pPr>
-        <w:pStyle w:val="Compact"/>
-        <w:numPr>
-          <w:ilvl w:val="1"/>
-          <w:numId w:val="1029"/>
-        </w:numPr>
-      </w:pPr>
-      <w:r>
-        <w:t xml:space="preserve">2</w:t>
-      </w:r>
-    </w:p>
-    <w:p>
-      <w:pPr>
-        <w:pStyle w:val="Compact"/>
-        <w:numPr>
-          <w:ilvl w:val="0"/>
-          <w:numId w:val="1027"/>
-        </w:numPr>
-      </w:pPr>
-    </w:p>
-    <w:p>
-      <w:pPr>
-        <w:pStyle w:val="Compact"/>
-        <w:numPr>
-          <w:ilvl w:val="1"/>
-          <w:numId w:val="1030"/>
-        </w:numPr>
-      </w:pPr>
-      <w:r>
-        <w:t xml:space="preserve">4</w:t>
-      </w:r>
-    </w:p>
-    <w:p>
-      <w:pPr>
-        <w:pStyle w:val="Compact"/>
-        <w:numPr>
-          <w:ilvl w:val="0"/>
-          <w:numId w:val="1027"/>
-        </w:numPr>
-      </w:pPr>
-    </w:p>
-    <w:p>
-      <w:pPr>
-        <w:pStyle w:val="Compact"/>
-        <w:numPr>
-          <w:ilvl w:val="1"/>
-          <w:numId w:val="1031"/>
-        </w:numPr>
-      </w:pPr>
-      <w:r>
-        <w:t xml:space="preserve">8</w:t>
-      </w:r>
-    </w:p>
-    <w:p>
-      <w:pPr>
-        <w:pStyle w:val="FirstParagraph"/>
+        <w:pStyle w:val="BodyText"/>
+      </w:pPr>
+      <w:r>
+        <w:t xml:space="preserve">a) 1</w:t>
+      </w:r>
+      <w:r>
+        <w:br/>
+      </w:r>
+      <w:r>
+        <w:t xml:space="preserve">b) 2</w:t>
+      </w:r>
+      <w:r>
+        <w:br/>
+      </w:r>
+      <w:r>
+        <w:t xml:space="preserve">c) 4</w:t>
+      </w:r>
+      <w:r>
+        <w:br/>
+      </w:r>
+      <w:r>
+        <w:t xml:space="preserve">d) 8</w:t>
+      </w:r>
+    </w:p>
+    <w:p>
+      <w:pPr>
+        <w:pStyle w:val="BodyText"/>
       </w:pPr>
       <w:r>
         <w:rPr>
@@ -2109,23 +1761,10 @@
     </w:p>
     <w:p>
       <w:pPr>
-        <w:pStyle w:val="Compact"/>
-        <w:numPr>
-          <w:ilvl w:val="0"/>
-          <w:numId w:val="1032"/>
-        </w:numPr>
-      </w:pPr>
-    </w:p>
-    <w:p>
-      <w:pPr>
-        <w:pStyle w:val="Compact"/>
-        <w:numPr>
-          <w:ilvl w:val="1"/>
-          <w:numId w:val="1033"/>
-        </w:numPr>
-      </w:pPr>
-      <w:r>
-        <w:t xml:space="preserve">Always</w:t>
+        <w:pStyle w:val="FirstParagraph"/>
+      </w:pPr>
+      <w:r>
+        <w:t xml:space="preserve">a) Always</w:t>
       </w:r>
       <w:r>
         <w:t xml:space="preserve"> </w:t>
@@ -2136,26 +1775,11 @@
         </w:rPr>
         <w:t xml:space="preserve">2</w:t>
       </w:r>
-    </w:p>
-    <w:p>
-      <w:pPr>
-        <w:pStyle w:val="Compact"/>
-        <w:numPr>
-          <w:ilvl w:val="0"/>
-          <w:numId w:val="1032"/>
-        </w:numPr>
-      </w:pPr>
-    </w:p>
-    <w:p>
-      <w:pPr>
-        <w:pStyle w:val="Compact"/>
-        <w:numPr>
-          <w:ilvl w:val="1"/>
-          <w:numId w:val="1034"/>
-        </w:numPr>
-      </w:pPr>
-      <w:r>
-        <w:t xml:space="preserve">Always</w:t>
+      <w:r>
+        <w:br/>
+      </w:r>
+      <w:r>
+        <w:t xml:space="preserve">b) Always</w:t>
       </w:r>
       <w:r>
         <w:t xml:space="preserve"> </w:t>
@@ -2166,26 +1790,11 @@
         </w:rPr>
         <w:t xml:space="preserve">1</w:t>
       </w:r>
-    </w:p>
-    <w:p>
-      <w:pPr>
-        <w:pStyle w:val="Compact"/>
-        <w:numPr>
-          <w:ilvl w:val="0"/>
-          <w:numId w:val="1032"/>
-        </w:numPr>
-      </w:pPr>
-    </w:p>
-    <w:p>
-      <w:pPr>
-        <w:pStyle w:val="Compact"/>
-        <w:numPr>
-          <w:ilvl w:val="1"/>
-          <w:numId w:val="1035"/>
-        </w:numPr>
-      </w:pPr>
-      <w:r>
-        <w:t xml:space="preserve">Either</w:t>
+      <w:r>
+        <w:br/>
+      </w:r>
+      <w:r>
+        <w:t xml:space="preserve">c) Either</w:t>
       </w:r>
       <w:r>
         <w:t xml:space="preserve"> </w:t>
@@ -2217,26 +1826,11 @@
       <w:r>
         <w:t xml:space="preserve">— the result is non-deterministic</w:t>
       </w:r>
-    </w:p>
-    <w:p>
-      <w:pPr>
-        <w:pStyle w:val="Compact"/>
-        <w:numPr>
-          <w:ilvl w:val="0"/>
-          <w:numId w:val="1032"/>
-        </w:numPr>
-      </w:pPr>
-    </w:p>
-    <w:p>
-      <w:pPr>
-        <w:pStyle w:val="Compact"/>
-        <w:numPr>
-          <w:ilvl w:val="1"/>
-          <w:numId w:val="1036"/>
-        </w:numPr>
-      </w:pPr>
-      <w:r>
-        <w:t xml:space="preserve">The program deadlocks on</w:t>
+      <w:r>
+        <w:br/>
+      </w:r>
+      <w:r>
+        <w:t xml:space="preserve">d) The program deadlocks on</w:t>
       </w:r>
       <w:r>
         <w:t xml:space="preserve"> </w:t>
@@ -2250,7 +1844,7 @@
     </w:p>
     <w:p>
       <w:pPr>
-        <w:pStyle w:val="FirstParagraph"/>
+        <w:pStyle w:val="BodyText"/>
       </w:pPr>
       <w:r>
         <w:rPr>
@@ -2870,21 +2464,14 @@
     </w:p>
     <w:p>
       <w:pPr>
-        <w:pStyle w:val="Compact"/>
-        <w:numPr>
-          <w:ilvl w:val="0"/>
-          <w:numId w:val="1037"/>
-        </w:numPr>
-      </w:pPr>
-    </w:p>
-    <w:p>
-      <w:pPr>
-        <w:pStyle w:val="Compact"/>
-        <w:numPr>
-          <w:ilvl w:val="1"/>
-          <w:numId w:val="1038"/>
-        </w:numPr>
-      </w:pPr>
+        <w:pStyle w:val="FirstParagraph"/>
+      </w:pPr>
+      <w:r>
+        <w:t xml:space="preserve">a)</w:t>
+      </w:r>
+      <w:r>
+        <w:t xml:space="preserve"> </w:t>
+      </w:r>
       <w:r>
         <w:rPr>
           <w:rStyle w:val="VerbatimChar"/>
@@ -2906,24 +2493,15 @@
         </w:rPr>
         <w:t xml:space="preserve">child</w:t>
       </w:r>
-    </w:p>
-    <w:p>
-      <w:pPr>
-        <w:pStyle w:val="Compact"/>
-        <w:numPr>
-          <w:ilvl w:val="0"/>
-          <w:numId w:val="1037"/>
-        </w:numPr>
-      </w:pPr>
-    </w:p>
-    <w:p>
-      <w:pPr>
-        <w:pStyle w:val="Compact"/>
-        <w:numPr>
-          <w:ilvl w:val="1"/>
-          <w:numId w:val="1039"/>
-        </w:numPr>
-      </w:pPr>
+      <w:r>
+        <w:br/>
+      </w:r>
+      <w:r>
+        <w:t xml:space="preserve">b)</w:t>
+      </w:r>
+      <w:r>
+        <w:t xml:space="preserve"> </w:t>
+      </w:r>
       <w:r>
         <w:rPr>
           <w:rStyle w:val="VerbatimChar"/>
@@ -2945,24 +2523,15 @@
         </w:rPr>
         <w:t xml:space="preserve">parent</w:t>
       </w:r>
-    </w:p>
-    <w:p>
-      <w:pPr>
-        <w:pStyle w:val="Compact"/>
-        <w:numPr>
-          <w:ilvl w:val="0"/>
-          <w:numId w:val="1037"/>
-        </w:numPr>
-      </w:pPr>
-    </w:p>
-    <w:p>
-      <w:pPr>
-        <w:pStyle w:val="Compact"/>
-        <w:numPr>
-          <w:ilvl w:val="1"/>
-          <w:numId w:val="1040"/>
-        </w:numPr>
-      </w:pPr>
+      <w:r>
+        <w:br/>
+      </w:r>
+      <w:r>
+        <w:t xml:space="preserve">c)</w:t>
+      </w:r>
+      <w:r>
+        <w:t xml:space="preserve"> </w:t>
+      </w:r>
       <w:r>
         <w:rPr>
           <w:rStyle w:val="VerbatimChar"/>
@@ -2990,26 +2559,11 @@
       <w:r>
         <w:t xml:space="preserve">in non-deterministic order</w:t>
       </w:r>
-    </w:p>
-    <w:p>
-      <w:pPr>
-        <w:pStyle w:val="Compact"/>
-        <w:numPr>
-          <w:ilvl w:val="0"/>
-          <w:numId w:val="1037"/>
-        </w:numPr>
-      </w:pPr>
-    </w:p>
-    <w:p>
-      <w:pPr>
-        <w:pStyle w:val="Compact"/>
-        <w:numPr>
-          <w:ilvl w:val="1"/>
-          <w:numId w:val="1041"/>
-        </w:numPr>
-      </w:pPr>
-      <w:r>
-        <w:t xml:space="preserve">Only</w:t>
+      <w:r>
+        <w:br/>
+      </w:r>
+      <w:r>
+        <w:t xml:space="preserve">d) Only</w:t>
       </w:r>
       <w:r>
         <w:t xml:space="preserve"> </w:t>
@@ -3029,7 +2583,7 @@
     </w:p>
     <w:p>
       <w:pPr>
-        <w:pStyle w:val="FirstParagraph"/>
+        <w:pStyle w:val="BodyText"/>
       </w:pPr>
       <w:r>
         <w:rPr>
@@ -3199,91 +2753,33 @@
     </w:p>
     <w:p>
       <w:pPr>
-        <w:pStyle w:val="Compact"/>
-        <w:numPr>
-          <w:ilvl w:val="0"/>
-          <w:numId w:val="1042"/>
-        </w:numPr>
-      </w:pPr>
-    </w:p>
-    <w:p>
-      <w:pPr>
-        <w:pStyle w:val="Compact"/>
-        <w:numPr>
-          <w:ilvl w:val="1"/>
-          <w:numId w:val="1043"/>
-        </w:numPr>
-      </w:pPr>
-      <w:r>
-        <w:t xml:space="preserve">The semaphore value increments by one and exactly one waiting thread is unblocked</w:t>
-      </w:r>
-    </w:p>
-    <w:p>
-      <w:pPr>
-        <w:pStyle w:val="Compact"/>
-        <w:numPr>
-          <w:ilvl w:val="0"/>
-          <w:numId w:val="1042"/>
-        </w:numPr>
-      </w:pPr>
-    </w:p>
-    <w:p>
-      <w:pPr>
-        <w:pStyle w:val="Compact"/>
-        <w:numPr>
-          <w:ilvl w:val="1"/>
-          <w:numId w:val="1044"/>
-        </w:numPr>
-      </w:pPr>
-      <w:r>
-        <w:t xml:space="preserve">The semaphore value increments by one for each waiting thread, and both are unblocked</w:t>
-      </w:r>
-    </w:p>
-    <w:p>
-      <w:pPr>
-        <w:pStyle w:val="Compact"/>
-        <w:numPr>
-          <w:ilvl w:val="0"/>
-          <w:numId w:val="1042"/>
-        </w:numPr>
-      </w:pPr>
-    </w:p>
-    <w:p>
-      <w:pPr>
-        <w:pStyle w:val="Compact"/>
-        <w:numPr>
-          <w:ilvl w:val="1"/>
-          <w:numId w:val="1045"/>
-        </w:numPr>
-      </w:pPr>
-      <w:r>
-        <w:t xml:space="preserve">All waiting threads are unblocked simultaneously (broadcast behaviour)</w:t>
-      </w:r>
-    </w:p>
-    <w:p>
-      <w:pPr>
-        <w:pStyle w:val="Compact"/>
-        <w:numPr>
-          <w:ilvl w:val="0"/>
-          <w:numId w:val="1042"/>
-        </w:numPr>
-      </w:pPr>
-    </w:p>
-    <w:p>
-      <w:pPr>
-        <w:pStyle w:val="Compact"/>
-        <w:numPr>
-          <w:ilvl w:val="1"/>
-          <w:numId w:val="1046"/>
-        </w:numPr>
-      </w:pPr>
-      <w:r>
-        <w:t xml:space="preserve">The call has no effect because the semaphore already has threads waiting</w:t>
-      </w:r>
-    </w:p>
-    <w:p>
-      <w:pPr>
-        <w:pStyle w:val="FirstParagraph"/>
+        <w:pStyle w:val="BodyText"/>
+      </w:pPr>
+      <w:r>
+        <w:t xml:space="preserve">a) The semaphore value increments by one and exactly one waiting thread is unblocked</w:t>
+      </w:r>
+      <w:r>
+        <w:br/>
+      </w:r>
+      <w:r>
+        <w:t xml:space="preserve">b) The semaphore value increments by one for each waiting thread, and both are unblocked</w:t>
+      </w:r>
+      <w:r>
+        <w:br/>
+      </w:r>
+      <w:r>
+        <w:t xml:space="preserve">c) All waiting threads are unblocked simultaneously (broadcast behaviour)</w:t>
+      </w:r>
+      <w:r>
+        <w:br/>
+      </w:r>
+      <w:r>
+        <w:t xml:space="preserve">d) The call has no effect because the semaphore already has threads waiting</w:t>
+      </w:r>
+    </w:p>
+    <w:p>
+      <w:pPr>
+        <w:pStyle w:val="BodyText"/>
       </w:pPr>
       <w:r>
         <w:rPr>
@@ -3399,91 +2895,33 @@
     </w:p>
     <w:p>
       <w:pPr>
-        <w:pStyle w:val="Compact"/>
-        <w:numPr>
-          <w:ilvl w:val="0"/>
-          <w:numId w:val="1047"/>
-        </w:numPr>
-      </w:pPr>
-    </w:p>
-    <w:p>
-      <w:pPr>
-        <w:pStyle w:val="Compact"/>
-        <w:numPr>
-          <w:ilvl w:val="1"/>
-          <w:numId w:val="1048"/>
-        </w:numPr>
-      </w:pPr>
-      <w:r>
-        <w:t xml:space="preserve">On a single core, the CPU cannot execute atomic instructions</w:t>
-      </w:r>
-    </w:p>
-    <w:p>
-      <w:pPr>
-        <w:pStyle w:val="Compact"/>
-        <w:numPr>
-          <w:ilvl w:val="0"/>
-          <w:numId w:val="1047"/>
-        </w:numPr>
-      </w:pPr>
-    </w:p>
-    <w:p>
-      <w:pPr>
-        <w:pStyle w:val="Compact"/>
-        <w:numPr>
-          <w:ilvl w:val="1"/>
-          <w:numId w:val="1049"/>
-        </w:numPr>
-      </w:pPr>
-      <w:r>
-        <w:t xml:space="preserve">The lock-holder is preempted while the spinner occupies the CPU, preventing the holder from ever releasing the lock without a timer interrupt</w:t>
-      </w:r>
-    </w:p>
-    <w:p>
-      <w:pPr>
-        <w:pStyle w:val="Compact"/>
-        <w:numPr>
-          <w:ilvl w:val="0"/>
-          <w:numId w:val="1047"/>
-        </w:numPr>
-      </w:pPr>
-    </w:p>
-    <w:p>
-      <w:pPr>
-        <w:pStyle w:val="Compact"/>
-        <w:numPr>
-          <w:ilvl w:val="1"/>
-          <w:numId w:val="1050"/>
-        </w:numPr>
-      </w:pPr>
-      <w:r>
-        <w:t xml:space="preserve">Spinlocks require hardware support not present on single-core CPUs</w:t>
-      </w:r>
-    </w:p>
-    <w:p>
-      <w:pPr>
-        <w:pStyle w:val="Compact"/>
-        <w:numPr>
-          <w:ilvl w:val="0"/>
-          <w:numId w:val="1047"/>
-        </w:numPr>
-      </w:pPr>
-    </w:p>
-    <w:p>
-      <w:pPr>
-        <w:pStyle w:val="Compact"/>
-        <w:numPr>
-          <w:ilvl w:val="1"/>
-          <w:numId w:val="1051"/>
-        </w:numPr>
-      </w:pPr>
-      <w:r>
-        <w:t xml:space="preserve">The OS disables spinlocks on single-core systems because they cause deadlock</w:t>
-      </w:r>
-    </w:p>
-    <w:p>
-      <w:pPr>
-        <w:pStyle w:val="FirstParagraph"/>
+        <w:pStyle w:val="BodyText"/>
+      </w:pPr>
+      <w:r>
+        <w:t xml:space="preserve">a) On a single core, the CPU cannot execute atomic instructions</w:t>
+      </w:r>
+      <w:r>
+        <w:br/>
+      </w:r>
+      <w:r>
+        <w:t xml:space="preserve">b) The lock-holder is preempted while the spinner occupies the CPU, preventing the holder from ever releasing the lock without a timer interrupt</w:t>
+      </w:r>
+      <w:r>
+        <w:br/>
+      </w:r>
+      <w:r>
+        <w:t xml:space="preserve">c) Spinlocks require hardware support not present on single-core CPUs</w:t>
+      </w:r>
+      <w:r>
+        <w:br/>
+      </w:r>
+      <w:r>
+        <w:t xml:space="preserve">d) The OS disables spinlocks on single-core systems because they cause deadlock</w:t>
+      </w:r>
+    </w:p>
+    <w:p>
+      <w:pPr>
+        <w:pStyle w:val="BodyText"/>
       </w:pPr>
       <w:r>
         <w:rPr>
@@ -3561,65 +2999,22 @@
     </w:p>
     <w:p>
       <w:pPr>
-        <w:pStyle w:val="Compact"/>
-        <w:numPr>
-          <w:ilvl w:val="0"/>
-          <w:numId w:val="1052"/>
-        </w:numPr>
-      </w:pPr>
-    </w:p>
-    <w:p>
-      <w:pPr>
-        <w:pStyle w:val="Compact"/>
-        <w:numPr>
-          <w:ilvl w:val="1"/>
-          <w:numId w:val="1053"/>
-        </w:numPr>
-      </w:pPr>
-      <w:r>
-        <w:t xml:space="preserve">The write blocks until a new reader opens the pipe</w:t>
-      </w:r>
-    </w:p>
-    <w:p>
-      <w:pPr>
-        <w:pStyle w:val="Compact"/>
-        <w:numPr>
-          <w:ilvl w:val="0"/>
-          <w:numId w:val="1052"/>
-        </w:numPr>
-      </w:pPr>
-    </w:p>
-    <w:p>
-      <w:pPr>
-        <w:pStyle w:val="Compact"/>
-        <w:numPr>
-          <w:ilvl w:val="1"/>
-          <w:numId w:val="1054"/>
-        </w:numPr>
-      </w:pPr>
-      <w:r>
-        <w:t xml:space="preserve">The write succeeds silently and data is buffered in the kernel</w:t>
-      </w:r>
-    </w:p>
-    <w:p>
-      <w:pPr>
-        <w:pStyle w:val="Compact"/>
-        <w:numPr>
-          <w:ilvl w:val="0"/>
-          <w:numId w:val="1052"/>
-        </w:numPr>
-      </w:pPr>
-    </w:p>
-    <w:p>
-      <w:pPr>
-        <w:pStyle w:val="Compact"/>
-        <w:numPr>
-          <w:ilvl w:val="1"/>
-          <w:numId w:val="1055"/>
-        </w:numPr>
-      </w:pPr>
-      <w:r>
-        <w:t xml:space="preserve">The writer process receives</w:t>
+        <w:pStyle w:val="BodyText"/>
+      </w:pPr>
+      <w:r>
+        <w:t xml:space="preserve">a) The write blocks until a new reader opens the pipe</w:t>
+      </w:r>
+      <w:r>
+        <w:br/>
+      </w:r>
+      <w:r>
+        <w:t xml:space="preserve">b) The write succeeds silently and data is buffered in the kernel</w:t>
+      </w:r>
+      <w:r>
+        <w:br/>
+      </w:r>
+      <w:r>
+        <w:t xml:space="preserve">c) The writer process receives</w:t>
       </w:r>
       <w:r>
         <w:t xml:space="preserve"> </w:t>
@@ -3645,31 +3040,16 @@
         </w:rPr>
         <w:t xml:space="preserve">EPIPE</w:t>
       </w:r>
-    </w:p>
-    <w:p>
-      <w:pPr>
-        <w:pStyle w:val="Compact"/>
-        <w:numPr>
-          <w:ilvl w:val="0"/>
-          <w:numId w:val="1052"/>
-        </w:numPr>
-      </w:pPr>
-    </w:p>
-    <w:p>
-      <w:pPr>
-        <w:pStyle w:val="Compact"/>
-        <w:numPr>
-          <w:ilvl w:val="1"/>
-          <w:numId w:val="1056"/>
-        </w:numPr>
-      </w:pPr>
-      <w:r>
-        <w:t xml:space="preserve">The kernel closes the write end automatically</w:t>
-      </w:r>
-    </w:p>
-    <w:p>
-      <w:pPr>
-        <w:pStyle w:val="FirstParagraph"/>
+      <w:r>
+        <w:br/>
+      </w:r>
+      <w:r>
+        <w:t xml:space="preserve">d) The kernel closes the write end automatically</w:t>
+      </w:r>
+    </w:p>
+    <w:p>
+      <w:pPr>
+        <w:pStyle w:val="BodyText"/>
       </w:pPr>
       <w:r>
         <w:rPr>
@@ -4079,7 +3459,7 @@
         <w:pStyle w:val="Compact"/>
         <w:numPr>
           <w:ilvl w:val="0"/>
-          <w:numId w:val="1057"/>
+          <w:numId w:val="1002"/>
         </w:numPr>
       </w:pPr>
       <w:r>
@@ -4117,7 +3497,7 @@
         <w:pStyle w:val="Compact"/>
         <w:numPr>
           <w:ilvl w:val="0"/>
-          <w:numId w:val="1057"/>
+          <w:numId w:val="1002"/>
         </w:numPr>
       </w:pPr>
       <w:r>
@@ -4184,7 +3564,7 @@
         <w:pStyle w:val="Compact"/>
         <w:numPr>
           <w:ilvl w:val="0"/>
-          <w:numId w:val="1057"/>
+          <w:numId w:val="1002"/>
         </w:numPr>
       </w:pPr>
       <w:r>
@@ -4206,7 +3586,7 @@
         <w:pStyle w:val="Compact"/>
         <w:numPr>
           <w:ilvl w:val="0"/>
-          <w:numId w:val="1057"/>
+          <w:numId w:val="1002"/>
         </w:numPr>
       </w:pPr>
       <w:r>
@@ -4228,7 +3608,7 @@
         <w:pStyle w:val="Compact"/>
         <w:numPr>
           <w:ilvl w:val="0"/>
-          <w:numId w:val="1057"/>
+          <w:numId w:val="1002"/>
         </w:numPr>
       </w:pPr>
       <w:r>
@@ -4479,346 +3859,6 @@
       </w:rPr>
     </w:lvl>
   </w:abstractNum>
-  <w:abstractNum w:abstractNumId="99721">
-    <w:nsid w:val="00A99721"/>
-    <w:multiLevelType w:val="multilevel"/>
-    <w:lvl w:ilvl="0">
-      <w:start w:val="1"/>
-      <w:numFmt w:val="lowerLetter"/>
-      <w:lvlText w:val="%1)"/>
-      <w:lvlJc w:val="left"/>
-      <w:pPr>
-        <w:ind w:left="720" w:hanging="360"/>
-      </w:pPr>
-    </w:lvl>
-    <w:lvl w:ilvl="1">
-      <w:start w:val="1"/>
-      <w:numFmt w:val="lowerLetter"/>
-      <w:lvlText w:val="%2)"/>
-      <w:lvlJc w:val="left"/>
-      <w:pPr>
-        <w:ind w:left="1440" w:hanging="360"/>
-      </w:pPr>
-    </w:lvl>
-    <w:lvl w:ilvl="2">
-      <w:start w:val="1"/>
-      <w:numFmt w:val="lowerLetter"/>
-      <w:lvlText w:val="%3)"/>
-      <w:lvlJc w:val="left"/>
-      <w:pPr>
-        <w:ind w:left="2160" w:hanging="360"/>
-      </w:pPr>
-    </w:lvl>
-    <w:lvl w:ilvl="3">
-      <w:start w:val="1"/>
-      <w:numFmt w:val="lowerLetter"/>
-      <w:lvlText w:val="%4)"/>
-      <w:lvlJc w:val="left"/>
-      <w:pPr>
-        <w:ind w:left="2880" w:hanging="360"/>
-      </w:pPr>
-    </w:lvl>
-    <w:lvl w:ilvl="4">
-      <w:start w:val="1"/>
-      <w:numFmt w:val="lowerLetter"/>
-      <w:lvlText w:val="%5)"/>
-      <w:lvlJc w:val="left"/>
-      <w:pPr>
-        <w:ind w:left="3600" w:hanging="360"/>
-      </w:pPr>
-    </w:lvl>
-    <w:lvl w:ilvl="5">
-      <w:start w:val="1"/>
-      <w:numFmt w:val="lowerLetter"/>
-      <w:lvlText w:val="%6)"/>
-      <w:lvlJc w:val="left"/>
-      <w:pPr>
-        <w:ind w:left="4320" w:hanging="360"/>
-      </w:pPr>
-    </w:lvl>
-    <w:lvl w:ilvl="6">
-      <w:start w:val="1"/>
-      <w:numFmt w:val="lowerLetter"/>
-      <w:lvlText w:val="%7)"/>
-      <w:lvlJc w:val="left"/>
-      <w:pPr>
-        <w:ind w:left="5040" w:hanging="360"/>
-      </w:pPr>
-    </w:lvl>
-    <w:lvl w:ilvl="7">
-      <w:start w:val="1"/>
-      <w:numFmt w:val="lowerLetter"/>
-      <w:lvlText w:val="%8)"/>
-      <w:lvlJc w:val="left"/>
-      <w:pPr>
-        <w:ind w:left="5760" w:hanging="360"/>
-      </w:pPr>
-    </w:lvl>
-    <w:lvl w:ilvl="8">
-      <w:start w:val="1"/>
-      <w:numFmt w:val="lowerLetter"/>
-      <w:lvlText w:val="%9)"/>
-      <w:lvlJc w:val="left"/>
-      <w:pPr>
-        <w:ind w:left="6480" w:hanging="360"/>
-      </w:pPr>
-    </w:lvl>
-  </w:abstractNum>
-  <w:abstractNum w:abstractNumId="99722">
-    <w:nsid w:val="00A99722"/>
-    <w:multiLevelType w:val="multilevel"/>
-    <w:lvl w:ilvl="0">
-      <w:start w:val="2"/>
-      <w:numFmt w:val="lowerLetter"/>
-      <w:lvlText w:val="%1)"/>
-      <w:lvlJc w:val="left"/>
-      <w:pPr>
-        <w:ind w:left="720" w:hanging="360"/>
-      </w:pPr>
-    </w:lvl>
-    <w:lvl w:ilvl="1">
-      <w:start w:val="2"/>
-      <w:numFmt w:val="lowerLetter"/>
-      <w:lvlText w:val="%2)"/>
-      <w:lvlJc w:val="left"/>
-      <w:pPr>
-        <w:ind w:left="1440" w:hanging="360"/>
-      </w:pPr>
-    </w:lvl>
-    <w:lvl w:ilvl="2">
-      <w:start w:val="2"/>
-      <w:numFmt w:val="lowerLetter"/>
-      <w:lvlText w:val="%3)"/>
-      <w:lvlJc w:val="left"/>
-      <w:pPr>
-        <w:ind w:left="2160" w:hanging="360"/>
-      </w:pPr>
-    </w:lvl>
-    <w:lvl w:ilvl="3">
-      <w:start w:val="2"/>
-      <w:numFmt w:val="lowerLetter"/>
-      <w:lvlText w:val="%4)"/>
-      <w:lvlJc w:val="left"/>
-      <w:pPr>
-        <w:ind w:left="2880" w:hanging="360"/>
-      </w:pPr>
-    </w:lvl>
-    <w:lvl w:ilvl="4">
-      <w:start w:val="2"/>
-      <w:numFmt w:val="lowerLetter"/>
-      <w:lvlText w:val="%5)"/>
-      <w:lvlJc w:val="left"/>
-      <w:pPr>
-        <w:ind w:left="3600" w:hanging="360"/>
-      </w:pPr>
-    </w:lvl>
-    <w:lvl w:ilvl="5">
-      <w:start w:val="2"/>
-      <w:numFmt w:val="lowerLetter"/>
-      <w:lvlText w:val="%6)"/>
-      <w:lvlJc w:val="left"/>
-      <w:pPr>
-        <w:ind w:left="4320" w:hanging="360"/>
-      </w:pPr>
-    </w:lvl>
-    <w:lvl w:ilvl="6">
-      <w:start w:val="2"/>
-      <w:numFmt w:val="lowerLetter"/>
-      <w:lvlText w:val="%7)"/>
-      <w:lvlJc w:val="left"/>
-      <w:pPr>
-        <w:ind w:left="5040" w:hanging="360"/>
-      </w:pPr>
-    </w:lvl>
-    <w:lvl w:ilvl="7">
-      <w:start w:val="2"/>
-      <w:numFmt w:val="lowerLetter"/>
-      <w:lvlText w:val="%8)"/>
-      <w:lvlJc w:val="left"/>
-      <w:pPr>
-        <w:ind w:left="5760" w:hanging="360"/>
-      </w:pPr>
-    </w:lvl>
-    <w:lvl w:ilvl="8">
-      <w:start w:val="2"/>
-      <w:numFmt w:val="lowerLetter"/>
-      <w:lvlText w:val="%9)"/>
-      <w:lvlJc w:val="left"/>
-      <w:pPr>
-        <w:ind w:left="6480" w:hanging="360"/>
-      </w:pPr>
-    </w:lvl>
-  </w:abstractNum>
-  <w:abstractNum w:abstractNumId="99723">
-    <w:nsid w:val="00A99723"/>
-    <w:multiLevelType w:val="multilevel"/>
-    <w:lvl w:ilvl="0">
-      <w:start w:val="3"/>
-      <w:numFmt w:val="lowerLetter"/>
-      <w:lvlText w:val="%1)"/>
-      <w:lvlJc w:val="left"/>
-      <w:pPr>
-        <w:ind w:left="720" w:hanging="360"/>
-      </w:pPr>
-    </w:lvl>
-    <w:lvl w:ilvl="1">
-      <w:start w:val="3"/>
-      <w:numFmt w:val="lowerLetter"/>
-      <w:lvlText w:val="%2)"/>
-      <w:lvlJc w:val="left"/>
-      <w:pPr>
-        <w:ind w:left="1440" w:hanging="360"/>
-      </w:pPr>
-    </w:lvl>
-    <w:lvl w:ilvl="2">
-      <w:start w:val="3"/>
-      <w:numFmt w:val="lowerLetter"/>
-      <w:lvlText w:val="%3)"/>
-      <w:lvlJc w:val="left"/>
-      <w:pPr>
-        <w:ind w:left="2160" w:hanging="360"/>
-      </w:pPr>
-    </w:lvl>
-    <w:lvl w:ilvl="3">
-      <w:start w:val="3"/>
-      <w:numFmt w:val="lowerLetter"/>
-      <w:lvlText w:val="%4)"/>
-      <w:lvlJc w:val="left"/>
-      <w:pPr>
-        <w:ind w:left="2880" w:hanging="360"/>
-      </w:pPr>
-    </w:lvl>
-    <w:lvl w:ilvl="4">
-      <w:start w:val="3"/>
-      <w:numFmt w:val="lowerLetter"/>
-      <w:lvlText w:val="%5)"/>
-      <w:lvlJc w:val="left"/>
-      <w:pPr>
-        <w:ind w:left="3600" w:hanging="360"/>
-      </w:pPr>
-    </w:lvl>
-    <w:lvl w:ilvl="5">
-      <w:start w:val="3"/>
-      <w:numFmt w:val="lowerLetter"/>
-      <w:lvlText w:val="%6)"/>
-      <w:lvlJc w:val="left"/>
-      <w:pPr>
-        <w:ind w:left="4320" w:hanging="360"/>
-      </w:pPr>
-    </w:lvl>
-    <w:lvl w:ilvl="6">
-      <w:start w:val="3"/>
-      <w:numFmt w:val="lowerLetter"/>
-      <w:lvlText w:val="%7)"/>
-      <w:lvlJc w:val="left"/>
-      <w:pPr>
-        <w:ind w:left="5040" w:hanging="360"/>
-      </w:pPr>
-    </w:lvl>
-    <w:lvl w:ilvl="7">
-      <w:start w:val="3"/>
-      <w:numFmt w:val="lowerLetter"/>
-      <w:lvlText w:val="%8)"/>
-      <w:lvlJc w:val="left"/>
-      <w:pPr>
-        <w:ind w:left="5760" w:hanging="360"/>
-      </w:pPr>
-    </w:lvl>
-    <w:lvl w:ilvl="8">
-      <w:start w:val="3"/>
-      <w:numFmt w:val="lowerLetter"/>
-      <w:lvlText w:val="%9)"/>
-      <w:lvlJc w:val="left"/>
-      <w:pPr>
-        <w:ind w:left="6480" w:hanging="360"/>
-      </w:pPr>
-    </w:lvl>
-  </w:abstractNum>
-  <w:abstractNum w:abstractNumId="99724">
-    <w:nsid w:val="00A99724"/>
-    <w:multiLevelType w:val="multilevel"/>
-    <w:lvl w:ilvl="0">
-      <w:start w:val="4"/>
-      <w:numFmt w:val="lowerLetter"/>
-      <w:lvlText w:val="%1)"/>
-      <w:lvlJc w:val="left"/>
-      <w:pPr>
-        <w:ind w:left="720" w:hanging="360"/>
-      </w:pPr>
-    </w:lvl>
-    <w:lvl w:ilvl="1">
-      <w:start w:val="4"/>
-      <w:numFmt w:val="lowerLetter"/>
-      <w:lvlText w:val="%2)"/>
-      <w:lvlJc w:val="left"/>
-      <w:pPr>
-        <w:ind w:left="1440" w:hanging="360"/>
-      </w:pPr>
-    </w:lvl>
-    <w:lvl w:ilvl="2">
-      <w:start w:val="4"/>
-      <w:numFmt w:val="lowerLetter"/>
-      <w:lvlText w:val="%3)"/>
-      <w:lvlJc w:val="left"/>
-      <w:pPr>
-        <w:ind w:left="2160" w:hanging="360"/>
-      </w:pPr>
-    </w:lvl>
-    <w:lvl w:ilvl="3">
-      <w:start w:val="4"/>
-      <w:numFmt w:val="lowerLetter"/>
-      <w:lvlText w:val="%4)"/>
-      <w:lvlJc w:val="left"/>
-      <w:pPr>
-        <w:ind w:left="2880" w:hanging="360"/>
-      </w:pPr>
-    </w:lvl>
-    <w:lvl w:ilvl="4">
-      <w:start w:val="4"/>
-      <w:numFmt w:val="lowerLetter"/>
-      <w:lvlText w:val="%5)"/>
-      <w:lvlJc w:val="left"/>
-      <w:pPr>
-        <w:ind w:left="3600" w:hanging="360"/>
-      </w:pPr>
-    </w:lvl>
-    <w:lvl w:ilvl="5">
-      <w:start w:val="4"/>
-      <w:numFmt w:val="lowerLetter"/>
-      <w:lvlText w:val="%6)"/>
-      <w:lvlJc w:val="left"/>
-      <w:pPr>
-        <w:ind w:left="4320" w:hanging="360"/>
-      </w:pPr>
-    </w:lvl>
-    <w:lvl w:ilvl="6">
-      <w:start w:val="4"/>
-      <w:numFmt w:val="lowerLetter"/>
-      <w:lvlText w:val="%7)"/>
-      <w:lvlJc w:val="left"/>
-      <w:pPr>
-        <w:ind w:left="5040" w:hanging="360"/>
-      </w:pPr>
-    </w:lvl>
-    <w:lvl w:ilvl="7">
-      <w:start w:val="4"/>
-      <w:numFmt w:val="lowerLetter"/>
-      <w:lvlText w:val="%8)"/>
-      <w:lvlJc w:val="left"/>
-      <w:pPr>
-        <w:ind w:left="5760" w:hanging="360"/>
-      </w:pPr>
-    </w:lvl>
-    <w:lvl w:ilvl="8">
-      <w:start w:val="4"/>
-      <w:numFmt w:val="lowerLetter"/>
-      <w:lvlText w:val="%9)"/>
-      <w:lvlJc w:val="left"/>
-      <w:pPr>
-        <w:ind w:left="6480" w:hanging="360"/>
-      </w:pPr>
-    </w:lvl>
-  </w:abstractNum>
   <w:abstractNum w:abstractNumId="99411">
     <w:nsid w:val="00A99411"/>
     <w:multiLevelType w:val="multilevel"/>
@@ -4911,1359 +3951,6 @@
     <w:abstractNumId w:val="991"/>
   </w:num>
   <w:num w:numId="1002">
-    <w:abstractNumId w:val="991"/>
-  </w:num>
-  <w:num w:numId="1003">
-    <w:abstractNumId w:val="99721"/>
-    <w:lvlOverride w:ilvl="0">
-      <w:startOverride w:val="1"/>
-    </w:lvlOverride>
-    <w:lvlOverride w:ilvl="1">
-      <w:startOverride w:val="1"/>
-    </w:lvlOverride>
-    <w:lvlOverride w:ilvl="2">
-      <w:startOverride w:val="1"/>
-    </w:lvlOverride>
-    <w:lvlOverride w:ilvl="3">
-      <w:startOverride w:val="1"/>
-    </w:lvlOverride>
-    <w:lvlOverride w:ilvl="4">
-      <w:startOverride w:val="1"/>
-    </w:lvlOverride>
-    <w:lvlOverride w:ilvl="5">
-      <w:startOverride w:val="1"/>
-    </w:lvlOverride>
-    <w:lvlOverride w:ilvl="6">
-      <w:startOverride w:val="1"/>
-    </w:lvlOverride>
-    <w:lvlOverride w:ilvl="7">
-      <w:startOverride w:val="1"/>
-    </w:lvlOverride>
-    <w:lvlOverride w:ilvl="8">
-      <w:startOverride w:val="1"/>
-    </w:lvlOverride>
-  </w:num>
-  <w:num w:numId="1004">
-    <w:abstractNumId w:val="99722"/>
-    <w:lvlOverride w:ilvl="0">
-      <w:startOverride w:val="2"/>
-    </w:lvlOverride>
-    <w:lvlOverride w:ilvl="1">
-      <w:startOverride w:val="2"/>
-    </w:lvlOverride>
-    <w:lvlOverride w:ilvl="2">
-      <w:startOverride w:val="2"/>
-    </w:lvlOverride>
-    <w:lvlOverride w:ilvl="3">
-      <w:startOverride w:val="2"/>
-    </w:lvlOverride>
-    <w:lvlOverride w:ilvl="4">
-      <w:startOverride w:val="2"/>
-    </w:lvlOverride>
-    <w:lvlOverride w:ilvl="5">
-      <w:startOverride w:val="2"/>
-    </w:lvlOverride>
-    <w:lvlOverride w:ilvl="6">
-      <w:startOverride w:val="2"/>
-    </w:lvlOverride>
-    <w:lvlOverride w:ilvl="7">
-      <w:startOverride w:val="2"/>
-    </w:lvlOverride>
-    <w:lvlOverride w:ilvl="8">
-      <w:startOverride w:val="2"/>
-    </w:lvlOverride>
-  </w:num>
-  <w:num w:numId="1005">
-    <w:abstractNumId w:val="99723"/>
-    <w:lvlOverride w:ilvl="0">
-      <w:startOverride w:val="3"/>
-    </w:lvlOverride>
-    <w:lvlOverride w:ilvl="1">
-      <w:startOverride w:val="3"/>
-    </w:lvlOverride>
-    <w:lvlOverride w:ilvl="2">
-      <w:startOverride w:val="3"/>
-    </w:lvlOverride>
-    <w:lvlOverride w:ilvl="3">
-      <w:startOverride w:val="3"/>
-    </w:lvlOverride>
-    <w:lvlOverride w:ilvl="4">
-      <w:startOverride w:val="3"/>
-    </w:lvlOverride>
-    <w:lvlOverride w:ilvl="5">
-      <w:startOverride w:val="3"/>
-    </w:lvlOverride>
-    <w:lvlOverride w:ilvl="6">
-      <w:startOverride w:val="3"/>
-    </w:lvlOverride>
-    <w:lvlOverride w:ilvl="7">
-      <w:startOverride w:val="3"/>
-    </w:lvlOverride>
-    <w:lvlOverride w:ilvl="8">
-      <w:startOverride w:val="3"/>
-    </w:lvlOverride>
-  </w:num>
-  <w:num w:numId="1006">
-    <w:abstractNumId w:val="99724"/>
-    <w:lvlOverride w:ilvl="0">
-      <w:startOverride w:val="4"/>
-    </w:lvlOverride>
-    <w:lvlOverride w:ilvl="1">
-      <w:startOverride w:val="4"/>
-    </w:lvlOverride>
-    <w:lvlOverride w:ilvl="2">
-      <w:startOverride w:val="4"/>
-    </w:lvlOverride>
-    <w:lvlOverride w:ilvl="3">
-      <w:startOverride w:val="4"/>
-    </w:lvlOverride>
-    <w:lvlOverride w:ilvl="4">
-      <w:startOverride w:val="4"/>
-    </w:lvlOverride>
-    <w:lvlOverride w:ilvl="5">
-      <w:startOverride w:val="4"/>
-    </w:lvlOverride>
-    <w:lvlOverride w:ilvl="6">
-      <w:startOverride w:val="4"/>
-    </w:lvlOverride>
-    <w:lvlOverride w:ilvl="7">
-      <w:startOverride w:val="4"/>
-    </w:lvlOverride>
-    <w:lvlOverride w:ilvl="8">
-      <w:startOverride w:val="4"/>
-    </w:lvlOverride>
-  </w:num>
-  <w:num w:numId="1007">
-    <w:abstractNumId w:val="991"/>
-  </w:num>
-  <w:num w:numId="1008">
-    <w:abstractNumId w:val="99721"/>
-    <w:lvlOverride w:ilvl="0">
-      <w:startOverride w:val="1"/>
-    </w:lvlOverride>
-    <w:lvlOverride w:ilvl="1">
-      <w:startOverride w:val="1"/>
-    </w:lvlOverride>
-    <w:lvlOverride w:ilvl="2">
-      <w:startOverride w:val="1"/>
-    </w:lvlOverride>
-    <w:lvlOverride w:ilvl="3">
-      <w:startOverride w:val="1"/>
-    </w:lvlOverride>
-    <w:lvlOverride w:ilvl="4">
-      <w:startOverride w:val="1"/>
-    </w:lvlOverride>
-    <w:lvlOverride w:ilvl="5">
-      <w:startOverride w:val="1"/>
-    </w:lvlOverride>
-    <w:lvlOverride w:ilvl="6">
-      <w:startOverride w:val="1"/>
-    </w:lvlOverride>
-    <w:lvlOverride w:ilvl="7">
-      <w:startOverride w:val="1"/>
-    </w:lvlOverride>
-    <w:lvlOverride w:ilvl="8">
-      <w:startOverride w:val="1"/>
-    </w:lvlOverride>
-  </w:num>
-  <w:num w:numId="1009">
-    <w:abstractNumId w:val="99722"/>
-    <w:lvlOverride w:ilvl="0">
-      <w:startOverride w:val="2"/>
-    </w:lvlOverride>
-    <w:lvlOverride w:ilvl="1">
-      <w:startOverride w:val="2"/>
-    </w:lvlOverride>
-    <w:lvlOverride w:ilvl="2">
-      <w:startOverride w:val="2"/>
-    </w:lvlOverride>
-    <w:lvlOverride w:ilvl="3">
-      <w:startOverride w:val="2"/>
-    </w:lvlOverride>
-    <w:lvlOverride w:ilvl="4">
-      <w:startOverride w:val="2"/>
-    </w:lvlOverride>
-    <w:lvlOverride w:ilvl="5">
-      <w:startOverride w:val="2"/>
-    </w:lvlOverride>
-    <w:lvlOverride w:ilvl="6">
-      <w:startOverride w:val="2"/>
-    </w:lvlOverride>
-    <w:lvlOverride w:ilvl="7">
-      <w:startOverride w:val="2"/>
-    </w:lvlOverride>
-    <w:lvlOverride w:ilvl="8">
-      <w:startOverride w:val="2"/>
-    </w:lvlOverride>
-  </w:num>
-  <w:num w:numId="1010">
-    <w:abstractNumId w:val="99723"/>
-    <w:lvlOverride w:ilvl="0">
-      <w:startOverride w:val="3"/>
-    </w:lvlOverride>
-    <w:lvlOverride w:ilvl="1">
-      <w:startOverride w:val="3"/>
-    </w:lvlOverride>
-    <w:lvlOverride w:ilvl="2">
-      <w:startOverride w:val="3"/>
-    </w:lvlOverride>
-    <w:lvlOverride w:ilvl="3">
-      <w:startOverride w:val="3"/>
-    </w:lvlOverride>
-    <w:lvlOverride w:ilvl="4">
-      <w:startOverride w:val="3"/>
-    </w:lvlOverride>
-    <w:lvlOverride w:ilvl="5">
-      <w:startOverride w:val="3"/>
-    </w:lvlOverride>
-    <w:lvlOverride w:ilvl="6">
-      <w:startOverride w:val="3"/>
-    </w:lvlOverride>
-    <w:lvlOverride w:ilvl="7">
-      <w:startOverride w:val="3"/>
-    </w:lvlOverride>
-    <w:lvlOverride w:ilvl="8">
-      <w:startOverride w:val="3"/>
-    </w:lvlOverride>
-  </w:num>
-  <w:num w:numId="1011">
-    <w:abstractNumId w:val="99724"/>
-    <w:lvlOverride w:ilvl="0">
-      <w:startOverride w:val="4"/>
-    </w:lvlOverride>
-    <w:lvlOverride w:ilvl="1">
-      <w:startOverride w:val="4"/>
-    </w:lvlOverride>
-    <w:lvlOverride w:ilvl="2">
-      <w:startOverride w:val="4"/>
-    </w:lvlOverride>
-    <w:lvlOverride w:ilvl="3">
-      <w:startOverride w:val="4"/>
-    </w:lvlOverride>
-    <w:lvlOverride w:ilvl="4">
-      <w:startOverride w:val="4"/>
-    </w:lvlOverride>
-    <w:lvlOverride w:ilvl="5">
-      <w:startOverride w:val="4"/>
-    </w:lvlOverride>
-    <w:lvlOverride w:ilvl="6">
-      <w:startOverride w:val="4"/>
-    </w:lvlOverride>
-    <w:lvlOverride w:ilvl="7">
-      <w:startOverride w:val="4"/>
-    </w:lvlOverride>
-    <w:lvlOverride w:ilvl="8">
-      <w:startOverride w:val="4"/>
-    </w:lvlOverride>
-  </w:num>
-  <w:num w:numId="1012">
-    <w:abstractNumId w:val="991"/>
-  </w:num>
-  <w:num w:numId="1013">
-    <w:abstractNumId w:val="99721"/>
-    <w:lvlOverride w:ilvl="0">
-      <w:startOverride w:val="1"/>
-    </w:lvlOverride>
-    <w:lvlOverride w:ilvl="1">
-      <w:startOverride w:val="1"/>
-    </w:lvlOverride>
-    <w:lvlOverride w:ilvl="2">
-      <w:startOverride w:val="1"/>
-    </w:lvlOverride>
-    <w:lvlOverride w:ilvl="3">
-      <w:startOverride w:val="1"/>
-    </w:lvlOverride>
-    <w:lvlOverride w:ilvl="4">
-      <w:startOverride w:val="1"/>
-    </w:lvlOverride>
-    <w:lvlOverride w:ilvl="5">
-      <w:startOverride w:val="1"/>
-    </w:lvlOverride>
-    <w:lvlOverride w:ilvl="6">
-      <w:startOverride w:val="1"/>
-    </w:lvlOverride>
-    <w:lvlOverride w:ilvl="7">
-      <w:startOverride w:val="1"/>
-    </w:lvlOverride>
-    <w:lvlOverride w:ilvl="8">
-      <w:startOverride w:val="1"/>
-    </w:lvlOverride>
-  </w:num>
-  <w:num w:numId="1014">
-    <w:abstractNumId w:val="99722"/>
-    <w:lvlOverride w:ilvl="0">
-      <w:startOverride w:val="2"/>
-    </w:lvlOverride>
-    <w:lvlOverride w:ilvl="1">
-      <w:startOverride w:val="2"/>
-    </w:lvlOverride>
-    <w:lvlOverride w:ilvl="2">
-      <w:startOverride w:val="2"/>
-    </w:lvlOverride>
-    <w:lvlOverride w:ilvl="3">
-      <w:startOverride w:val="2"/>
-    </w:lvlOverride>
-    <w:lvlOverride w:ilvl="4">
-      <w:startOverride w:val="2"/>
-    </w:lvlOverride>
-    <w:lvlOverride w:ilvl="5">
-      <w:startOverride w:val="2"/>
-    </w:lvlOverride>
-    <w:lvlOverride w:ilvl="6">
-      <w:startOverride w:val="2"/>
-    </w:lvlOverride>
-    <w:lvlOverride w:ilvl="7">
-      <w:startOverride w:val="2"/>
-    </w:lvlOverride>
-    <w:lvlOverride w:ilvl="8">
-      <w:startOverride w:val="2"/>
-    </w:lvlOverride>
-  </w:num>
-  <w:num w:numId="1015">
-    <w:abstractNumId w:val="99723"/>
-    <w:lvlOverride w:ilvl="0">
-      <w:startOverride w:val="3"/>
-    </w:lvlOverride>
-    <w:lvlOverride w:ilvl="1">
-      <w:startOverride w:val="3"/>
-    </w:lvlOverride>
-    <w:lvlOverride w:ilvl="2">
-      <w:startOverride w:val="3"/>
-    </w:lvlOverride>
-    <w:lvlOverride w:ilvl="3">
-      <w:startOverride w:val="3"/>
-    </w:lvlOverride>
-    <w:lvlOverride w:ilvl="4">
-      <w:startOverride w:val="3"/>
-    </w:lvlOverride>
-    <w:lvlOverride w:ilvl="5">
-      <w:startOverride w:val="3"/>
-    </w:lvlOverride>
-    <w:lvlOverride w:ilvl="6">
-      <w:startOverride w:val="3"/>
-    </w:lvlOverride>
-    <w:lvlOverride w:ilvl="7">
-      <w:startOverride w:val="3"/>
-    </w:lvlOverride>
-    <w:lvlOverride w:ilvl="8">
-      <w:startOverride w:val="3"/>
-    </w:lvlOverride>
-  </w:num>
-  <w:num w:numId="1016">
-    <w:abstractNumId w:val="99724"/>
-    <w:lvlOverride w:ilvl="0">
-      <w:startOverride w:val="4"/>
-    </w:lvlOverride>
-    <w:lvlOverride w:ilvl="1">
-      <w:startOverride w:val="4"/>
-    </w:lvlOverride>
-    <w:lvlOverride w:ilvl="2">
-      <w:startOverride w:val="4"/>
-    </w:lvlOverride>
-    <w:lvlOverride w:ilvl="3">
-      <w:startOverride w:val="4"/>
-    </w:lvlOverride>
-    <w:lvlOverride w:ilvl="4">
-      <w:startOverride w:val="4"/>
-    </w:lvlOverride>
-    <w:lvlOverride w:ilvl="5">
-      <w:startOverride w:val="4"/>
-    </w:lvlOverride>
-    <w:lvlOverride w:ilvl="6">
-      <w:startOverride w:val="4"/>
-    </w:lvlOverride>
-    <w:lvlOverride w:ilvl="7">
-      <w:startOverride w:val="4"/>
-    </w:lvlOverride>
-    <w:lvlOverride w:ilvl="8">
-      <w:startOverride w:val="4"/>
-    </w:lvlOverride>
-  </w:num>
-  <w:num w:numId="1017">
-    <w:abstractNumId w:val="991"/>
-  </w:num>
-  <w:num w:numId="1018">
-    <w:abstractNumId w:val="99721"/>
-    <w:lvlOverride w:ilvl="0">
-      <w:startOverride w:val="1"/>
-    </w:lvlOverride>
-    <w:lvlOverride w:ilvl="1">
-      <w:startOverride w:val="1"/>
-    </w:lvlOverride>
-    <w:lvlOverride w:ilvl="2">
-      <w:startOverride w:val="1"/>
-    </w:lvlOverride>
-    <w:lvlOverride w:ilvl="3">
-      <w:startOverride w:val="1"/>
-    </w:lvlOverride>
-    <w:lvlOverride w:ilvl="4">
-      <w:startOverride w:val="1"/>
-    </w:lvlOverride>
-    <w:lvlOverride w:ilvl="5">
-      <w:startOverride w:val="1"/>
-    </w:lvlOverride>
-    <w:lvlOverride w:ilvl="6">
-      <w:startOverride w:val="1"/>
-    </w:lvlOverride>
-    <w:lvlOverride w:ilvl="7">
-      <w:startOverride w:val="1"/>
-    </w:lvlOverride>
-    <w:lvlOverride w:ilvl="8">
-      <w:startOverride w:val="1"/>
-    </w:lvlOverride>
-  </w:num>
-  <w:num w:numId="1019">
-    <w:abstractNumId w:val="99722"/>
-    <w:lvlOverride w:ilvl="0">
-      <w:startOverride w:val="2"/>
-    </w:lvlOverride>
-    <w:lvlOverride w:ilvl="1">
-      <w:startOverride w:val="2"/>
-    </w:lvlOverride>
-    <w:lvlOverride w:ilvl="2">
-      <w:startOverride w:val="2"/>
-    </w:lvlOverride>
-    <w:lvlOverride w:ilvl="3">
-      <w:startOverride w:val="2"/>
-    </w:lvlOverride>
-    <w:lvlOverride w:ilvl="4">
-      <w:startOverride w:val="2"/>
-    </w:lvlOverride>
-    <w:lvlOverride w:ilvl="5">
-      <w:startOverride w:val="2"/>
-    </w:lvlOverride>
-    <w:lvlOverride w:ilvl="6">
-      <w:startOverride w:val="2"/>
-    </w:lvlOverride>
-    <w:lvlOverride w:ilvl="7">
-      <w:startOverride w:val="2"/>
-    </w:lvlOverride>
-    <w:lvlOverride w:ilvl="8">
-      <w:startOverride w:val="2"/>
-    </w:lvlOverride>
-  </w:num>
-  <w:num w:numId="1020">
-    <w:abstractNumId w:val="99723"/>
-    <w:lvlOverride w:ilvl="0">
-      <w:startOverride w:val="3"/>
-    </w:lvlOverride>
-    <w:lvlOverride w:ilvl="1">
-      <w:startOverride w:val="3"/>
-    </w:lvlOverride>
-    <w:lvlOverride w:ilvl="2">
-      <w:startOverride w:val="3"/>
-    </w:lvlOverride>
-    <w:lvlOverride w:ilvl="3">
-      <w:startOverride w:val="3"/>
-    </w:lvlOverride>
-    <w:lvlOverride w:ilvl="4">
-      <w:startOverride w:val="3"/>
-    </w:lvlOverride>
-    <w:lvlOverride w:ilvl="5">
-      <w:startOverride w:val="3"/>
-    </w:lvlOverride>
-    <w:lvlOverride w:ilvl="6">
-      <w:startOverride w:val="3"/>
-    </w:lvlOverride>
-    <w:lvlOverride w:ilvl="7">
-      <w:startOverride w:val="3"/>
-    </w:lvlOverride>
-    <w:lvlOverride w:ilvl="8">
-      <w:startOverride w:val="3"/>
-    </w:lvlOverride>
-  </w:num>
-  <w:num w:numId="1021">
-    <w:abstractNumId w:val="99724"/>
-    <w:lvlOverride w:ilvl="0">
-      <w:startOverride w:val="4"/>
-    </w:lvlOverride>
-    <w:lvlOverride w:ilvl="1">
-      <w:startOverride w:val="4"/>
-    </w:lvlOverride>
-    <w:lvlOverride w:ilvl="2">
-      <w:startOverride w:val="4"/>
-    </w:lvlOverride>
-    <w:lvlOverride w:ilvl="3">
-      <w:startOverride w:val="4"/>
-    </w:lvlOverride>
-    <w:lvlOverride w:ilvl="4">
-      <w:startOverride w:val="4"/>
-    </w:lvlOverride>
-    <w:lvlOverride w:ilvl="5">
-      <w:startOverride w:val="4"/>
-    </w:lvlOverride>
-    <w:lvlOverride w:ilvl="6">
-      <w:startOverride w:val="4"/>
-    </w:lvlOverride>
-    <w:lvlOverride w:ilvl="7">
-      <w:startOverride w:val="4"/>
-    </w:lvlOverride>
-    <w:lvlOverride w:ilvl="8">
-      <w:startOverride w:val="4"/>
-    </w:lvlOverride>
-  </w:num>
-  <w:num w:numId="1022">
-    <w:abstractNumId w:val="991"/>
-  </w:num>
-  <w:num w:numId="1023">
-    <w:abstractNumId w:val="99721"/>
-    <w:lvlOverride w:ilvl="0">
-      <w:startOverride w:val="1"/>
-    </w:lvlOverride>
-    <w:lvlOverride w:ilvl="1">
-      <w:startOverride w:val="1"/>
-    </w:lvlOverride>
-    <w:lvlOverride w:ilvl="2">
-      <w:startOverride w:val="1"/>
-    </w:lvlOverride>
-    <w:lvlOverride w:ilvl="3">
-      <w:startOverride w:val="1"/>
-    </w:lvlOverride>
-    <w:lvlOverride w:ilvl="4">
-      <w:startOverride w:val="1"/>
-    </w:lvlOverride>
-    <w:lvlOverride w:ilvl="5">
-      <w:startOverride w:val="1"/>
-    </w:lvlOverride>
-    <w:lvlOverride w:ilvl="6">
-      <w:startOverride w:val="1"/>
-    </w:lvlOverride>
-    <w:lvlOverride w:ilvl="7">
-      <w:startOverride w:val="1"/>
-    </w:lvlOverride>
-    <w:lvlOverride w:ilvl="8">
-      <w:startOverride w:val="1"/>
-    </w:lvlOverride>
-  </w:num>
-  <w:num w:numId="1024">
-    <w:abstractNumId w:val="99722"/>
-    <w:lvlOverride w:ilvl="0">
-      <w:startOverride w:val="2"/>
-    </w:lvlOverride>
-    <w:lvlOverride w:ilvl="1">
-      <w:startOverride w:val="2"/>
-    </w:lvlOverride>
-    <w:lvlOverride w:ilvl="2">
-      <w:startOverride w:val="2"/>
-    </w:lvlOverride>
-    <w:lvlOverride w:ilvl="3">
-      <w:startOverride w:val="2"/>
-    </w:lvlOverride>
-    <w:lvlOverride w:ilvl="4">
-      <w:startOverride w:val="2"/>
-    </w:lvlOverride>
-    <w:lvlOverride w:ilvl="5">
-      <w:startOverride w:val="2"/>
-    </w:lvlOverride>
-    <w:lvlOverride w:ilvl="6">
-      <w:startOverride w:val="2"/>
-    </w:lvlOverride>
-    <w:lvlOverride w:ilvl="7">
-      <w:startOverride w:val="2"/>
-    </w:lvlOverride>
-    <w:lvlOverride w:ilvl="8">
-      <w:startOverride w:val="2"/>
-    </w:lvlOverride>
-  </w:num>
-  <w:num w:numId="1025">
-    <w:abstractNumId w:val="99723"/>
-    <w:lvlOverride w:ilvl="0">
-      <w:startOverride w:val="3"/>
-    </w:lvlOverride>
-    <w:lvlOverride w:ilvl="1">
-      <w:startOverride w:val="3"/>
-    </w:lvlOverride>
-    <w:lvlOverride w:ilvl="2">
-      <w:startOverride w:val="3"/>
-    </w:lvlOverride>
-    <w:lvlOverride w:ilvl="3">
-      <w:startOverride w:val="3"/>
-    </w:lvlOverride>
-    <w:lvlOverride w:ilvl="4">
-      <w:startOverride w:val="3"/>
-    </w:lvlOverride>
-    <w:lvlOverride w:ilvl="5">
-      <w:startOverride w:val="3"/>
-    </w:lvlOverride>
-    <w:lvlOverride w:ilvl="6">
-      <w:startOverride w:val="3"/>
-    </w:lvlOverride>
-    <w:lvlOverride w:ilvl="7">
-      <w:startOverride w:val="3"/>
-    </w:lvlOverride>
-    <w:lvlOverride w:ilvl="8">
-      <w:startOverride w:val="3"/>
-    </w:lvlOverride>
-  </w:num>
-  <w:num w:numId="1026">
-    <w:abstractNumId w:val="99724"/>
-    <w:lvlOverride w:ilvl="0">
-      <w:startOverride w:val="4"/>
-    </w:lvlOverride>
-    <w:lvlOverride w:ilvl="1">
-      <w:startOverride w:val="4"/>
-    </w:lvlOverride>
-    <w:lvlOverride w:ilvl="2">
-      <w:startOverride w:val="4"/>
-    </w:lvlOverride>
-    <w:lvlOverride w:ilvl="3">
-      <w:startOverride w:val="4"/>
-    </w:lvlOverride>
-    <w:lvlOverride w:ilvl="4">
-      <w:startOverride w:val="4"/>
-    </w:lvlOverride>
-    <w:lvlOverride w:ilvl="5">
-      <w:startOverride w:val="4"/>
-    </w:lvlOverride>
-    <w:lvlOverride w:ilvl="6">
-      <w:startOverride w:val="4"/>
-    </w:lvlOverride>
-    <w:lvlOverride w:ilvl="7">
-      <w:startOverride w:val="4"/>
-    </w:lvlOverride>
-    <w:lvlOverride w:ilvl="8">
-      <w:startOverride w:val="4"/>
-    </w:lvlOverride>
-  </w:num>
-  <w:num w:numId="1027">
-    <w:abstractNumId w:val="991"/>
-  </w:num>
-  <w:num w:numId="1028">
-    <w:abstractNumId w:val="99721"/>
-    <w:lvlOverride w:ilvl="0">
-      <w:startOverride w:val="1"/>
-    </w:lvlOverride>
-    <w:lvlOverride w:ilvl="1">
-      <w:startOverride w:val="1"/>
-    </w:lvlOverride>
-    <w:lvlOverride w:ilvl="2">
-      <w:startOverride w:val="1"/>
-    </w:lvlOverride>
-    <w:lvlOverride w:ilvl="3">
-      <w:startOverride w:val="1"/>
-    </w:lvlOverride>
-    <w:lvlOverride w:ilvl="4">
-      <w:startOverride w:val="1"/>
-    </w:lvlOverride>
-    <w:lvlOverride w:ilvl="5">
-      <w:startOverride w:val="1"/>
-    </w:lvlOverride>
-    <w:lvlOverride w:ilvl="6">
-      <w:startOverride w:val="1"/>
-    </w:lvlOverride>
-    <w:lvlOverride w:ilvl="7">
-      <w:startOverride w:val="1"/>
-    </w:lvlOverride>
-    <w:lvlOverride w:ilvl="8">
-      <w:startOverride w:val="1"/>
-    </w:lvlOverride>
-  </w:num>
-  <w:num w:numId="1029">
-    <w:abstractNumId w:val="99722"/>
-    <w:lvlOverride w:ilvl="0">
-      <w:startOverride w:val="2"/>
-    </w:lvlOverride>
-    <w:lvlOverride w:ilvl="1">
-      <w:startOverride w:val="2"/>
-    </w:lvlOverride>
-    <w:lvlOverride w:ilvl="2">
-      <w:startOverride w:val="2"/>
-    </w:lvlOverride>
-    <w:lvlOverride w:ilvl="3">
-      <w:startOverride w:val="2"/>
-    </w:lvlOverride>
-    <w:lvlOverride w:ilvl="4">
-      <w:startOverride w:val="2"/>
-    </w:lvlOverride>
-    <w:lvlOverride w:ilvl="5">
-      <w:startOverride w:val="2"/>
-    </w:lvlOverride>
-    <w:lvlOverride w:ilvl="6">
-      <w:startOverride w:val="2"/>
-    </w:lvlOverride>
-    <w:lvlOverride w:ilvl="7">
-      <w:startOverride w:val="2"/>
-    </w:lvlOverride>
-    <w:lvlOverride w:ilvl="8">
-      <w:startOverride w:val="2"/>
-    </w:lvlOverride>
-  </w:num>
-  <w:num w:numId="1030">
-    <w:abstractNumId w:val="99723"/>
-    <w:lvlOverride w:ilvl="0">
-      <w:startOverride w:val="3"/>
-    </w:lvlOverride>
-    <w:lvlOverride w:ilvl="1">
-      <w:startOverride w:val="3"/>
-    </w:lvlOverride>
-    <w:lvlOverride w:ilvl="2">
-      <w:startOverride w:val="3"/>
-    </w:lvlOverride>
-    <w:lvlOverride w:ilvl="3">
-      <w:startOverride w:val="3"/>
-    </w:lvlOverride>
-    <w:lvlOverride w:ilvl="4">
-      <w:startOverride w:val="3"/>
-    </w:lvlOverride>
-    <w:lvlOverride w:ilvl="5">
-      <w:startOverride w:val="3"/>
-    </w:lvlOverride>
-    <w:lvlOverride w:ilvl="6">
-      <w:startOverride w:val="3"/>
-    </w:lvlOverride>
-    <w:lvlOverride w:ilvl="7">
-      <w:startOverride w:val="3"/>
-    </w:lvlOverride>
-    <w:lvlOverride w:ilvl="8">
-      <w:startOverride w:val="3"/>
-    </w:lvlOverride>
-  </w:num>
-  <w:num w:numId="1031">
-    <w:abstractNumId w:val="99724"/>
-    <w:lvlOverride w:ilvl="0">
-      <w:startOverride w:val="4"/>
-    </w:lvlOverride>
-    <w:lvlOverride w:ilvl="1">
-      <w:startOverride w:val="4"/>
-    </w:lvlOverride>
-    <w:lvlOverride w:ilvl="2">
-      <w:startOverride w:val="4"/>
-    </w:lvlOverride>
-    <w:lvlOverride w:ilvl="3">
-      <w:startOverride w:val="4"/>
-    </w:lvlOverride>
-    <w:lvlOverride w:ilvl="4">
-      <w:startOverride w:val="4"/>
-    </w:lvlOverride>
-    <w:lvlOverride w:ilvl="5">
-      <w:startOverride w:val="4"/>
-    </w:lvlOverride>
-    <w:lvlOverride w:ilvl="6">
-      <w:startOverride w:val="4"/>
-    </w:lvlOverride>
-    <w:lvlOverride w:ilvl="7">
-      <w:startOverride w:val="4"/>
-    </w:lvlOverride>
-    <w:lvlOverride w:ilvl="8">
-      <w:startOverride w:val="4"/>
-    </w:lvlOverride>
-  </w:num>
-  <w:num w:numId="1032">
-    <w:abstractNumId w:val="991"/>
-  </w:num>
-  <w:num w:numId="1033">
-    <w:abstractNumId w:val="99721"/>
-    <w:lvlOverride w:ilvl="0">
-      <w:startOverride w:val="1"/>
-    </w:lvlOverride>
-    <w:lvlOverride w:ilvl="1">
-      <w:startOverride w:val="1"/>
-    </w:lvlOverride>
-    <w:lvlOverride w:ilvl="2">
-      <w:startOverride w:val="1"/>
-    </w:lvlOverride>
-    <w:lvlOverride w:ilvl="3">
-      <w:startOverride w:val="1"/>
-    </w:lvlOverride>
-    <w:lvlOverride w:ilvl="4">
-      <w:startOverride w:val="1"/>
-    </w:lvlOverride>
-    <w:lvlOverride w:ilvl="5">
-      <w:startOverride w:val="1"/>
-    </w:lvlOverride>
-    <w:lvlOverride w:ilvl="6">
-      <w:startOverride w:val="1"/>
-    </w:lvlOverride>
-    <w:lvlOverride w:ilvl="7">
-      <w:startOverride w:val="1"/>
-    </w:lvlOverride>
-    <w:lvlOverride w:ilvl="8">
-      <w:startOverride w:val="1"/>
-    </w:lvlOverride>
-  </w:num>
-  <w:num w:numId="1034">
-    <w:abstractNumId w:val="99722"/>
-    <w:lvlOverride w:ilvl="0">
-      <w:startOverride w:val="2"/>
-    </w:lvlOverride>
-    <w:lvlOverride w:ilvl="1">
-      <w:startOverride w:val="2"/>
-    </w:lvlOverride>
-    <w:lvlOverride w:ilvl="2">
-      <w:startOverride w:val="2"/>
-    </w:lvlOverride>
-    <w:lvlOverride w:ilvl="3">
-      <w:startOverride w:val="2"/>
-    </w:lvlOverride>
-    <w:lvlOverride w:ilvl="4">
-      <w:startOverride w:val="2"/>
-    </w:lvlOverride>
-    <w:lvlOverride w:ilvl="5">
-      <w:startOverride w:val="2"/>
-    </w:lvlOverride>
-    <w:lvlOverride w:ilvl="6">
-      <w:startOverride w:val="2"/>
-    </w:lvlOverride>
-    <w:lvlOverride w:ilvl="7">
-      <w:startOverride w:val="2"/>
-    </w:lvlOverride>
-    <w:lvlOverride w:ilvl="8">
-      <w:startOverride w:val="2"/>
-    </w:lvlOverride>
-  </w:num>
-  <w:num w:numId="1035">
-    <w:abstractNumId w:val="99723"/>
-    <w:lvlOverride w:ilvl="0">
-      <w:startOverride w:val="3"/>
-    </w:lvlOverride>
-    <w:lvlOverride w:ilvl="1">
-      <w:startOverride w:val="3"/>
-    </w:lvlOverride>
-    <w:lvlOverride w:ilvl="2">
-      <w:startOverride w:val="3"/>
-    </w:lvlOverride>
-    <w:lvlOverride w:ilvl="3">
-      <w:startOverride w:val="3"/>
-    </w:lvlOverride>
-    <w:lvlOverride w:ilvl="4">
-      <w:startOverride w:val="3"/>
-    </w:lvlOverride>
-    <w:lvlOverride w:ilvl="5">
-      <w:startOverride w:val="3"/>
-    </w:lvlOverride>
-    <w:lvlOverride w:ilvl="6">
-      <w:startOverride w:val="3"/>
-    </w:lvlOverride>
-    <w:lvlOverride w:ilvl="7">
-      <w:startOverride w:val="3"/>
-    </w:lvlOverride>
-    <w:lvlOverride w:ilvl="8">
-      <w:startOverride w:val="3"/>
-    </w:lvlOverride>
-  </w:num>
-  <w:num w:numId="1036">
-    <w:abstractNumId w:val="99724"/>
-    <w:lvlOverride w:ilvl="0">
-      <w:startOverride w:val="4"/>
-    </w:lvlOverride>
-    <w:lvlOverride w:ilvl="1">
-      <w:startOverride w:val="4"/>
-    </w:lvlOverride>
-    <w:lvlOverride w:ilvl="2">
-      <w:startOverride w:val="4"/>
-    </w:lvlOverride>
-    <w:lvlOverride w:ilvl="3">
-      <w:startOverride w:val="4"/>
-    </w:lvlOverride>
-    <w:lvlOverride w:ilvl="4">
-      <w:startOverride w:val="4"/>
-    </w:lvlOverride>
-    <w:lvlOverride w:ilvl="5">
-      <w:startOverride w:val="4"/>
-    </w:lvlOverride>
-    <w:lvlOverride w:ilvl="6">
-      <w:startOverride w:val="4"/>
-    </w:lvlOverride>
-    <w:lvlOverride w:ilvl="7">
-      <w:startOverride w:val="4"/>
-    </w:lvlOverride>
-    <w:lvlOverride w:ilvl="8">
-      <w:startOverride w:val="4"/>
-    </w:lvlOverride>
-  </w:num>
-  <w:num w:numId="1037">
-    <w:abstractNumId w:val="991"/>
-  </w:num>
-  <w:num w:numId="1038">
-    <w:abstractNumId w:val="99721"/>
-    <w:lvlOverride w:ilvl="0">
-      <w:startOverride w:val="1"/>
-    </w:lvlOverride>
-    <w:lvlOverride w:ilvl="1">
-      <w:startOverride w:val="1"/>
-    </w:lvlOverride>
-    <w:lvlOverride w:ilvl="2">
-      <w:startOverride w:val="1"/>
-    </w:lvlOverride>
-    <w:lvlOverride w:ilvl="3">
-      <w:startOverride w:val="1"/>
-    </w:lvlOverride>
-    <w:lvlOverride w:ilvl="4">
-      <w:startOverride w:val="1"/>
-    </w:lvlOverride>
-    <w:lvlOverride w:ilvl="5">
-      <w:startOverride w:val="1"/>
-    </w:lvlOverride>
-    <w:lvlOverride w:ilvl="6">
-      <w:startOverride w:val="1"/>
-    </w:lvlOverride>
-    <w:lvlOverride w:ilvl="7">
-      <w:startOverride w:val="1"/>
-    </w:lvlOverride>
-    <w:lvlOverride w:ilvl="8">
-      <w:startOverride w:val="1"/>
-    </w:lvlOverride>
-  </w:num>
-  <w:num w:numId="1039">
-    <w:abstractNumId w:val="99722"/>
-    <w:lvlOverride w:ilvl="0">
-      <w:startOverride w:val="2"/>
-    </w:lvlOverride>
-    <w:lvlOverride w:ilvl="1">
-      <w:startOverride w:val="2"/>
-    </w:lvlOverride>
-    <w:lvlOverride w:ilvl="2">
-      <w:startOverride w:val="2"/>
-    </w:lvlOverride>
-    <w:lvlOverride w:ilvl="3">
-      <w:startOverride w:val="2"/>
-    </w:lvlOverride>
-    <w:lvlOverride w:ilvl="4">
-      <w:startOverride w:val="2"/>
-    </w:lvlOverride>
-    <w:lvlOverride w:ilvl="5">
-      <w:startOverride w:val="2"/>
-    </w:lvlOverride>
-    <w:lvlOverride w:ilvl="6">
-      <w:startOverride w:val="2"/>
-    </w:lvlOverride>
-    <w:lvlOverride w:ilvl="7">
-      <w:startOverride w:val="2"/>
-    </w:lvlOverride>
-    <w:lvlOverride w:ilvl="8">
-      <w:startOverride w:val="2"/>
-    </w:lvlOverride>
-  </w:num>
-  <w:num w:numId="1040">
-    <w:abstractNumId w:val="99723"/>
-    <w:lvlOverride w:ilvl="0">
-      <w:startOverride w:val="3"/>
-    </w:lvlOverride>
-    <w:lvlOverride w:ilvl="1">
-      <w:startOverride w:val="3"/>
-    </w:lvlOverride>
-    <w:lvlOverride w:ilvl="2">
-      <w:startOverride w:val="3"/>
-    </w:lvlOverride>
-    <w:lvlOverride w:ilvl="3">
-      <w:startOverride w:val="3"/>
-    </w:lvlOverride>
-    <w:lvlOverride w:ilvl="4">
-      <w:startOverride w:val="3"/>
-    </w:lvlOverride>
-    <w:lvlOverride w:ilvl="5">
-      <w:startOverride w:val="3"/>
-    </w:lvlOverride>
-    <w:lvlOverride w:ilvl="6">
-      <w:startOverride w:val="3"/>
-    </w:lvlOverride>
-    <w:lvlOverride w:ilvl="7">
-      <w:startOverride w:val="3"/>
-    </w:lvlOverride>
-    <w:lvlOverride w:ilvl="8">
-      <w:startOverride w:val="3"/>
-    </w:lvlOverride>
-  </w:num>
-  <w:num w:numId="1041">
-    <w:abstractNumId w:val="99724"/>
-    <w:lvlOverride w:ilvl="0">
-      <w:startOverride w:val="4"/>
-    </w:lvlOverride>
-    <w:lvlOverride w:ilvl="1">
-      <w:startOverride w:val="4"/>
-    </w:lvlOverride>
-    <w:lvlOverride w:ilvl="2">
-      <w:startOverride w:val="4"/>
-    </w:lvlOverride>
-    <w:lvlOverride w:ilvl="3">
-      <w:startOverride w:val="4"/>
-    </w:lvlOverride>
-    <w:lvlOverride w:ilvl="4">
-      <w:startOverride w:val="4"/>
-    </w:lvlOverride>
-    <w:lvlOverride w:ilvl="5">
-      <w:startOverride w:val="4"/>
-    </w:lvlOverride>
-    <w:lvlOverride w:ilvl="6">
-      <w:startOverride w:val="4"/>
-    </w:lvlOverride>
-    <w:lvlOverride w:ilvl="7">
-      <w:startOverride w:val="4"/>
-    </w:lvlOverride>
-    <w:lvlOverride w:ilvl="8">
-      <w:startOverride w:val="4"/>
-    </w:lvlOverride>
-  </w:num>
-  <w:num w:numId="1042">
-    <w:abstractNumId w:val="991"/>
-  </w:num>
-  <w:num w:numId="1043">
-    <w:abstractNumId w:val="99721"/>
-    <w:lvlOverride w:ilvl="0">
-      <w:startOverride w:val="1"/>
-    </w:lvlOverride>
-    <w:lvlOverride w:ilvl="1">
-      <w:startOverride w:val="1"/>
-    </w:lvlOverride>
-    <w:lvlOverride w:ilvl="2">
-      <w:startOverride w:val="1"/>
-    </w:lvlOverride>
-    <w:lvlOverride w:ilvl="3">
-      <w:startOverride w:val="1"/>
-    </w:lvlOverride>
-    <w:lvlOverride w:ilvl="4">
-      <w:startOverride w:val="1"/>
-    </w:lvlOverride>
-    <w:lvlOverride w:ilvl="5">
-      <w:startOverride w:val="1"/>
-    </w:lvlOverride>
-    <w:lvlOverride w:ilvl="6">
-      <w:startOverride w:val="1"/>
-    </w:lvlOverride>
-    <w:lvlOverride w:ilvl="7">
-      <w:startOverride w:val="1"/>
-    </w:lvlOverride>
-    <w:lvlOverride w:ilvl="8">
-      <w:startOverride w:val="1"/>
-    </w:lvlOverride>
-  </w:num>
-  <w:num w:numId="1044">
-    <w:abstractNumId w:val="99722"/>
-    <w:lvlOverride w:ilvl="0">
-      <w:startOverride w:val="2"/>
-    </w:lvlOverride>
-    <w:lvlOverride w:ilvl="1">
-      <w:startOverride w:val="2"/>
-    </w:lvlOverride>
-    <w:lvlOverride w:ilvl="2">
-      <w:startOverride w:val="2"/>
-    </w:lvlOverride>
-    <w:lvlOverride w:ilvl="3">
-      <w:startOverride w:val="2"/>
-    </w:lvlOverride>
-    <w:lvlOverride w:ilvl="4">
-      <w:startOverride w:val="2"/>
-    </w:lvlOverride>
-    <w:lvlOverride w:ilvl="5">
-      <w:startOverride w:val="2"/>
-    </w:lvlOverride>
-    <w:lvlOverride w:ilvl="6">
-      <w:startOverride w:val="2"/>
-    </w:lvlOverride>
-    <w:lvlOverride w:ilvl="7">
-      <w:startOverride w:val="2"/>
-    </w:lvlOverride>
-    <w:lvlOverride w:ilvl="8">
-      <w:startOverride w:val="2"/>
-    </w:lvlOverride>
-  </w:num>
-  <w:num w:numId="1045">
-    <w:abstractNumId w:val="99723"/>
-    <w:lvlOverride w:ilvl="0">
-      <w:startOverride w:val="3"/>
-    </w:lvlOverride>
-    <w:lvlOverride w:ilvl="1">
-      <w:startOverride w:val="3"/>
-    </w:lvlOverride>
-    <w:lvlOverride w:ilvl="2">
-      <w:startOverride w:val="3"/>
-    </w:lvlOverride>
-    <w:lvlOverride w:ilvl="3">
-      <w:startOverride w:val="3"/>
-    </w:lvlOverride>
-    <w:lvlOverride w:ilvl="4">
-      <w:startOverride w:val="3"/>
-    </w:lvlOverride>
-    <w:lvlOverride w:ilvl="5">
-      <w:startOverride w:val="3"/>
-    </w:lvlOverride>
-    <w:lvlOverride w:ilvl="6">
-      <w:startOverride w:val="3"/>
-    </w:lvlOverride>
-    <w:lvlOverride w:ilvl="7">
-      <w:startOverride w:val="3"/>
-    </w:lvlOverride>
-    <w:lvlOverride w:ilvl="8">
-      <w:startOverride w:val="3"/>
-    </w:lvlOverride>
-  </w:num>
-  <w:num w:numId="1046">
-    <w:abstractNumId w:val="99724"/>
-    <w:lvlOverride w:ilvl="0">
-      <w:startOverride w:val="4"/>
-    </w:lvlOverride>
-    <w:lvlOverride w:ilvl="1">
-      <w:startOverride w:val="4"/>
-    </w:lvlOverride>
-    <w:lvlOverride w:ilvl="2">
-      <w:startOverride w:val="4"/>
-    </w:lvlOverride>
-    <w:lvlOverride w:ilvl="3">
-      <w:startOverride w:val="4"/>
-    </w:lvlOverride>
-    <w:lvlOverride w:ilvl="4">
-      <w:startOverride w:val="4"/>
-    </w:lvlOverride>
-    <w:lvlOverride w:ilvl="5">
-      <w:startOverride w:val="4"/>
-    </w:lvlOverride>
-    <w:lvlOverride w:ilvl="6">
-      <w:startOverride w:val="4"/>
-    </w:lvlOverride>
-    <w:lvlOverride w:ilvl="7">
-      <w:startOverride w:val="4"/>
-    </w:lvlOverride>
-    <w:lvlOverride w:ilvl="8">
-      <w:startOverride w:val="4"/>
-    </w:lvlOverride>
-  </w:num>
-  <w:num w:numId="1047">
-    <w:abstractNumId w:val="991"/>
-  </w:num>
-  <w:num w:numId="1048">
-    <w:abstractNumId w:val="99721"/>
-    <w:lvlOverride w:ilvl="0">
-      <w:startOverride w:val="1"/>
-    </w:lvlOverride>
-    <w:lvlOverride w:ilvl="1">
-      <w:startOverride w:val="1"/>
-    </w:lvlOverride>
-    <w:lvlOverride w:ilvl="2">
-      <w:startOverride w:val="1"/>
-    </w:lvlOverride>
-    <w:lvlOverride w:ilvl="3">
-      <w:startOverride w:val="1"/>
-    </w:lvlOverride>
-    <w:lvlOverride w:ilvl="4">
-      <w:startOverride w:val="1"/>
-    </w:lvlOverride>
-    <w:lvlOverride w:ilvl="5">
-      <w:startOverride w:val="1"/>
-    </w:lvlOverride>
-    <w:lvlOverride w:ilvl="6">
-      <w:startOverride w:val="1"/>
-    </w:lvlOverride>
-    <w:lvlOverride w:ilvl="7">
-      <w:startOverride w:val="1"/>
-    </w:lvlOverride>
-    <w:lvlOverride w:ilvl="8">
-      <w:startOverride w:val="1"/>
-    </w:lvlOverride>
-  </w:num>
-  <w:num w:numId="1049">
-    <w:abstractNumId w:val="99722"/>
-    <w:lvlOverride w:ilvl="0">
-      <w:startOverride w:val="2"/>
-    </w:lvlOverride>
-    <w:lvlOverride w:ilvl="1">
-      <w:startOverride w:val="2"/>
-    </w:lvlOverride>
-    <w:lvlOverride w:ilvl="2">
-      <w:startOverride w:val="2"/>
-    </w:lvlOverride>
-    <w:lvlOverride w:ilvl="3">
-      <w:startOverride w:val="2"/>
-    </w:lvlOverride>
-    <w:lvlOverride w:ilvl="4">
-      <w:startOverride w:val="2"/>
-    </w:lvlOverride>
-    <w:lvlOverride w:ilvl="5">
-      <w:startOverride w:val="2"/>
-    </w:lvlOverride>
-    <w:lvlOverride w:ilvl="6">
-      <w:startOverride w:val="2"/>
-    </w:lvlOverride>
-    <w:lvlOverride w:ilvl="7">
-      <w:startOverride w:val="2"/>
-    </w:lvlOverride>
-    <w:lvlOverride w:ilvl="8">
-      <w:startOverride w:val="2"/>
-    </w:lvlOverride>
-  </w:num>
-  <w:num w:numId="1050">
-    <w:abstractNumId w:val="99723"/>
-    <w:lvlOverride w:ilvl="0">
-      <w:startOverride w:val="3"/>
-    </w:lvlOverride>
-    <w:lvlOverride w:ilvl="1">
-      <w:startOverride w:val="3"/>
-    </w:lvlOverride>
-    <w:lvlOverride w:ilvl="2">
-      <w:startOverride w:val="3"/>
-    </w:lvlOverride>
-    <w:lvlOverride w:ilvl="3">
-      <w:startOverride w:val="3"/>
-    </w:lvlOverride>
-    <w:lvlOverride w:ilvl="4">
-      <w:startOverride w:val="3"/>
-    </w:lvlOverride>
-    <w:lvlOverride w:ilvl="5">
-      <w:startOverride w:val="3"/>
-    </w:lvlOverride>
-    <w:lvlOverride w:ilvl="6">
-      <w:startOverride w:val="3"/>
-    </w:lvlOverride>
-    <w:lvlOverride w:ilvl="7">
-      <w:startOverride w:val="3"/>
-    </w:lvlOverride>
-    <w:lvlOverride w:ilvl="8">
-      <w:startOverride w:val="3"/>
-    </w:lvlOverride>
-  </w:num>
-  <w:num w:numId="1051">
-    <w:abstractNumId w:val="99724"/>
-    <w:lvlOverride w:ilvl="0">
-      <w:startOverride w:val="4"/>
-    </w:lvlOverride>
-    <w:lvlOverride w:ilvl="1">
-      <w:startOverride w:val="4"/>
-    </w:lvlOverride>
-    <w:lvlOverride w:ilvl="2">
-      <w:startOverride w:val="4"/>
-    </w:lvlOverride>
-    <w:lvlOverride w:ilvl="3">
-      <w:startOverride w:val="4"/>
-    </w:lvlOverride>
-    <w:lvlOverride w:ilvl="4">
-      <w:startOverride w:val="4"/>
-    </w:lvlOverride>
-    <w:lvlOverride w:ilvl="5">
-      <w:startOverride w:val="4"/>
-    </w:lvlOverride>
-    <w:lvlOverride w:ilvl="6">
-      <w:startOverride w:val="4"/>
-    </w:lvlOverride>
-    <w:lvlOverride w:ilvl="7">
-      <w:startOverride w:val="4"/>
-    </w:lvlOverride>
-    <w:lvlOverride w:ilvl="8">
-      <w:startOverride w:val="4"/>
-    </w:lvlOverride>
-  </w:num>
-  <w:num w:numId="1052">
-    <w:abstractNumId w:val="991"/>
-  </w:num>
-  <w:num w:numId="1053">
-    <w:abstractNumId w:val="99721"/>
-    <w:lvlOverride w:ilvl="0">
-      <w:startOverride w:val="1"/>
-    </w:lvlOverride>
-    <w:lvlOverride w:ilvl="1">
-      <w:startOverride w:val="1"/>
-    </w:lvlOverride>
-    <w:lvlOverride w:ilvl="2">
-      <w:startOverride w:val="1"/>
-    </w:lvlOverride>
-    <w:lvlOverride w:ilvl="3">
-      <w:startOverride w:val="1"/>
-    </w:lvlOverride>
-    <w:lvlOverride w:ilvl="4">
-      <w:startOverride w:val="1"/>
-    </w:lvlOverride>
-    <w:lvlOverride w:ilvl="5">
-      <w:startOverride w:val="1"/>
-    </w:lvlOverride>
-    <w:lvlOverride w:ilvl="6">
-      <w:startOverride w:val="1"/>
-    </w:lvlOverride>
-    <w:lvlOverride w:ilvl="7">
-      <w:startOverride w:val="1"/>
-    </w:lvlOverride>
-    <w:lvlOverride w:ilvl="8">
-      <w:startOverride w:val="1"/>
-    </w:lvlOverride>
-  </w:num>
-  <w:num w:numId="1054">
-    <w:abstractNumId w:val="99722"/>
-    <w:lvlOverride w:ilvl="0">
-      <w:startOverride w:val="2"/>
-    </w:lvlOverride>
-    <w:lvlOverride w:ilvl="1">
-      <w:startOverride w:val="2"/>
-    </w:lvlOverride>
-    <w:lvlOverride w:ilvl="2">
-      <w:startOverride w:val="2"/>
-    </w:lvlOverride>
-    <w:lvlOverride w:ilvl="3">
-      <w:startOverride w:val="2"/>
-    </w:lvlOverride>
-    <w:lvlOverride w:ilvl="4">
-      <w:startOverride w:val="2"/>
-    </w:lvlOverride>
-    <w:lvlOverride w:ilvl="5">
-      <w:startOverride w:val="2"/>
-    </w:lvlOverride>
-    <w:lvlOverride w:ilvl="6">
-      <w:startOverride w:val="2"/>
-    </w:lvlOverride>
-    <w:lvlOverride w:ilvl="7">
-      <w:startOverride w:val="2"/>
-    </w:lvlOverride>
-    <w:lvlOverride w:ilvl="8">
-      <w:startOverride w:val="2"/>
-    </w:lvlOverride>
-  </w:num>
-  <w:num w:numId="1055">
-    <w:abstractNumId w:val="99723"/>
-    <w:lvlOverride w:ilvl="0">
-      <w:startOverride w:val="3"/>
-    </w:lvlOverride>
-    <w:lvlOverride w:ilvl="1">
-      <w:startOverride w:val="3"/>
-    </w:lvlOverride>
-    <w:lvlOverride w:ilvl="2">
-      <w:startOverride w:val="3"/>
-    </w:lvlOverride>
-    <w:lvlOverride w:ilvl="3">
-      <w:startOverride w:val="3"/>
-    </w:lvlOverride>
-    <w:lvlOverride w:ilvl="4">
-      <w:startOverride w:val="3"/>
-    </w:lvlOverride>
-    <w:lvlOverride w:ilvl="5">
-      <w:startOverride w:val="3"/>
-    </w:lvlOverride>
-    <w:lvlOverride w:ilvl="6">
-      <w:startOverride w:val="3"/>
-    </w:lvlOverride>
-    <w:lvlOverride w:ilvl="7">
-      <w:startOverride w:val="3"/>
-    </w:lvlOverride>
-    <w:lvlOverride w:ilvl="8">
-      <w:startOverride w:val="3"/>
-    </w:lvlOverride>
-  </w:num>
-  <w:num w:numId="1056">
-    <w:abstractNumId w:val="99724"/>
-    <w:lvlOverride w:ilvl="0">
-      <w:startOverride w:val="4"/>
-    </w:lvlOverride>
-    <w:lvlOverride w:ilvl="1">
-      <w:startOverride w:val="4"/>
-    </w:lvlOverride>
-    <w:lvlOverride w:ilvl="2">
-      <w:startOverride w:val="4"/>
-    </w:lvlOverride>
-    <w:lvlOverride w:ilvl="3">
-      <w:startOverride w:val="4"/>
-    </w:lvlOverride>
-    <w:lvlOverride w:ilvl="4">
-      <w:startOverride w:val="4"/>
-    </w:lvlOverride>
-    <w:lvlOverride w:ilvl="5">
-      <w:startOverride w:val="4"/>
-    </w:lvlOverride>
-    <w:lvlOverride w:ilvl="6">
-      <w:startOverride w:val="4"/>
-    </w:lvlOverride>
-    <w:lvlOverride w:ilvl="7">
-      <w:startOverride w:val="4"/>
-    </w:lvlOverride>
-    <w:lvlOverride w:ilvl="8">
-      <w:startOverride w:val="4"/>
-    </w:lvlOverride>
-  </w:num>
-  <w:num w:numId="1057">
     <w:abstractNumId w:val="99411"/>
     <w:lvlOverride w:ilvl="0">
       <w:startOverride w:val="1"/>

</xml_diff>